<commit_message>
Did headings 5 and 6
</commit_message>
<xml_diff>
--- a/Report1.docx
+++ b/Report1.docx
@@ -1,32 +1,25 @@
 
 <file path=word/document.xml><?xml version="1.0" encoding="utf-8"?>
-<w:document xmlns:wpc="http://schemas.microsoft.com/office/word/2010/wordprocessingCanvas" xmlns:mc="http://schemas.openxmlformats.org/markup-compatibility/2006" xmlns:o="urn:schemas-microsoft-com:office:office" xmlns:r="http://schemas.openxmlformats.org/officeDocument/2006/relationships" xmlns:m="http://schemas.openxmlformats.org/officeDocument/2006/math" xmlns:v="urn:schemas-microsoft-com:vml" xmlns:wp14="http://schemas.microsoft.com/office/word/2010/wordprocessingDrawing" xmlns:wp="http://schemas.openxmlformats.org/drawingml/2006/wordprocessingDrawing" xmlns:w10="urn:schemas-microsoft-com:office:word" xmlns:w="http://schemas.openxmlformats.org/wordprocessingml/2006/main" xmlns:w14="http://schemas.microsoft.com/office/word/2010/wordml" xmlns:w15="http://schemas.microsoft.com/office/word/2012/wordml" xmlns:wpg="http://schemas.microsoft.com/office/word/2010/wordprocessingGroup" xmlns:wpi="http://schemas.microsoft.com/office/word/2010/wordprocessingInk" xmlns:wne="http://schemas.microsoft.com/office/word/2006/wordml" xmlns:wps="http://schemas.microsoft.com/office/word/2010/wordprocessingShape" xmlns:w16se="http://schemas.microsoft.com/office/word/2015/wordml/symex" xmlns:w16cid="http://schemas.microsoft.com/office/word/2016/wordml/cid" xmlns:w16="http://schemas.microsoft.com/office/word/2018/wordml" xmlns:w16cex="http://schemas.microsoft.com/office/word/2018/wordml/cex" xmlns:w16sdtdh="http://schemas.microsoft.com/office/word/2020/wordml/sdtdatahash" xmlns:w16sdtfl="http://schemas.microsoft.com/office/word/2024/wordml/sdtformatlock" mc:Ignorable="w14 w15 wp14 w16se w16cid w16 w16cex w16sdtdh w16sdtfl">
+<w:document xmlns:wpc="http://schemas.microsoft.com/office/word/2010/wordprocessingCanvas" xmlns:cx="http://schemas.microsoft.com/office/drawing/2014/chartex" xmlns:cx1="http://schemas.microsoft.com/office/drawing/2015/9/8/chartex" xmlns:cx2="http://schemas.microsoft.com/office/drawing/2015/10/21/chartex" xmlns:cx3="http://schemas.microsoft.com/office/drawing/2016/5/9/chartex" xmlns:cx4="http://schemas.microsoft.com/office/drawing/2016/5/10/chartex" xmlns:cx5="http://schemas.microsoft.com/office/drawing/2016/5/11/chartex" xmlns:cx6="http://schemas.microsoft.com/office/drawing/2016/5/12/chartex" xmlns:cx7="http://schemas.microsoft.com/office/drawing/2016/5/13/chartex" xmlns:cx8="http://schemas.microsoft.com/office/drawing/2016/5/14/chartex" xmlns:mc="http://schemas.openxmlformats.org/markup-compatibility/2006" xmlns:aink="http://schemas.microsoft.com/office/drawing/2016/ink" xmlns:am3d="http://schemas.microsoft.com/office/drawing/2017/model3d" xmlns:o="urn:schemas-microsoft-com:office:office" xmlns:oel="http://schemas.microsoft.com/office/2019/extlst" xmlns:r="http://schemas.openxmlformats.org/officeDocument/2006/relationships" xmlns:m="http://schemas.openxmlformats.org/officeDocument/2006/math" xmlns:v="urn:schemas-microsoft-com:vml" xmlns:wp14="http://schemas.microsoft.com/office/word/2010/wordprocessingDrawing" xmlns:wp="http://schemas.openxmlformats.org/drawingml/2006/wordprocessingDrawing" xmlns:w10="urn:schemas-microsoft-com:office:word" xmlns:w="http://schemas.openxmlformats.org/wordprocessingml/2006/main" xmlns:w14="http://schemas.microsoft.com/office/word/2010/wordml" xmlns:w15="http://schemas.microsoft.com/office/word/2012/wordml" xmlns:w16cex="http://schemas.microsoft.com/office/word/2018/wordml/cex" xmlns:w16cid="http://schemas.microsoft.com/office/word/2016/wordml/cid" xmlns:w16="http://schemas.microsoft.com/office/word/2018/wordml" xmlns:w16du="http://schemas.microsoft.com/office/word/2023/wordml/word16du" xmlns:w16sdtdh="http://schemas.microsoft.com/office/word/2020/wordml/sdtdatahash" xmlns:w16sdtfl="http://schemas.microsoft.com/office/word/2024/wordml/sdtformatlock" xmlns:w16se="http://schemas.microsoft.com/office/word/2015/wordml/symex" xmlns:wpg="http://schemas.microsoft.com/office/word/2010/wordprocessingGroup" xmlns:wpi="http://schemas.microsoft.com/office/word/2010/wordprocessingInk" xmlns:wne="http://schemas.microsoft.com/office/word/2006/wordml" xmlns:wps="http://schemas.microsoft.com/office/word/2010/wordprocessingShape" mc:Ignorable="w14 w15 w16se w16cid w16 w16cex w16sdtdh w16sdtfl w16du wp14">
   <w:body>
     <w:p>
       <w:pPr>
         <w:jc w:val="center"/>
       </w:pPr>
       <w:r>
-        <w:rPr/>
-        <w:t>REPORT</w:t>
-      </w:r>
-    </w:p>
-    <w:p>
-      <w:pPr>
-        <w:jc w:val="both"/>
-      </w:pPr>
-      <w:r>
-        <w:rPr/>
+        <w:t>DESIGN REPORT</w:t>
+      </w:r>
+    </w:p>
+    <w:p>
+      <w:pPr>
+        <w:jc w:val="both"/>
+      </w:pPr>
+      <w:r>
         <w:t>Project overview and problem statement</w:t>
       </w:r>
     </w:p>
     <w:p>
       <w:pPr>
-        <w:jc w:val="both"/>
-      </w:pPr>
-    </w:p>
-    <w:p>
-      <w:pPr>
         <w:pStyle w:val="Normal"/>
         <w:jc w:val="both"/>
       </w:pPr>
@@ -37,119 +30,703 @@
     </w:p>
     <w:p>
       <w:pPr>
+        <w:jc w:val="both"/>
+      </w:pPr>
+      <w:r>
+        <w:t>System design: Inputs, Processes, Outputs (IPO)</w:t>
+      </w:r>
+    </w:p>
+    <w:p>
+      <w:pPr>
+        <w:jc w:val="both"/>
+      </w:pPr>
+      <w:r>
+        <w:t>Architecture overview (client, data storage, optional auth, serverless functions if used)</w:t>
+      </w:r>
+    </w:p>
+    <w:p>
+      <w:pPr>
+        <w:jc w:val="both"/>
+        <w:rPr>
+          <w:b/>
+          <w:bCs/>
+        </w:rPr>
+      </w:pPr>
+      <w:r>
+        <w:rPr>
+          <w:b/>
+          <w:bCs/>
+        </w:rPr>
+        <w:t xml:space="preserve">Data design (conceptual): key entities and relationships; what you will NOT collect (data </w:t>
+      </w:r>
+      <w:r>
+        <w:rPr>
+          <w:b/>
+          <w:bCs/>
+        </w:rPr>
+        <w:t>minimization</w:t>
+      </w:r>
+      <w:r>
+        <w:rPr>
+          <w:b/>
+          <w:bCs/>
+        </w:rPr>
+        <w:t>)</w:t>
+      </w:r>
+    </w:p>
+    <w:p>
+      <w:pPr>
+        <w:jc w:val="both"/>
+      </w:pPr>
+      <w:r>
+        <w:rPr/>
+        <w:t xml:space="preserve">The key entities we chose to </w:t>
+      </w:r>
+      <w:r>
+        <w:rPr/>
+        <w:t>put in</w:t>
+      </w:r>
+      <w:r>
+        <w:rPr/>
+        <w:t>to</w:t>
+      </w:r>
+      <w:r>
+        <w:rPr/>
+        <w:t xml:space="preserve"> the application were</w:t>
+      </w:r>
+      <w:r>
+        <w:rPr/>
+        <w:t xml:space="preserve"> </w:t>
+      </w:r>
+      <w:r>
+        <w:rPr/>
+        <w:t xml:space="preserve">a canteen menu, </w:t>
+      </w:r>
+      <w:r>
+        <w:rPr/>
+        <w:t xml:space="preserve">a helpdesk and lost &amp; found page, a map and timetable. </w:t>
+      </w:r>
+    </w:p>
+    <w:p>
+      <w:pPr>
+        <w:jc w:val="both"/>
+      </w:pPr>
+      <w:r>
+        <w:rPr/>
+        <w:t xml:space="preserve">For data minimization, </w:t>
+      </w:r>
+      <w:r>
+        <w:rPr/>
+        <w:t xml:space="preserve">we </w:t>
+      </w:r>
+      <w:r>
+        <w:rPr/>
+        <w:t>won't</w:t>
+      </w:r>
+      <w:r>
+        <w:rPr/>
+        <w:t xml:space="preserve"> </w:t>
+      </w:r>
+      <w:r>
+        <w:rPr/>
+        <w:t>be collecting</w:t>
+      </w:r>
+      <w:r>
+        <w:rPr/>
+        <w:t xml:space="preserve"> any personal information that includes a personal email, phone number</w:t>
+      </w:r>
+      <w:r>
+        <w:rPr/>
+        <w:t>,</w:t>
+      </w:r>
+      <w:r>
+        <w:rPr/>
+        <w:t xml:space="preserve"> or address. </w:t>
+      </w:r>
+      <w:r>
+        <w:rPr/>
+        <w:t xml:space="preserve">What the application will be collecting is only the bare minimum, so our </w:t>
+      </w:r>
+      <w:r>
+        <w:rPr/>
+        <w:t>pages</w:t>
+      </w:r>
+      <w:r>
+        <w:rPr/>
+        <w:t xml:space="preserve"> can be </w:t>
+      </w:r>
+      <w:r>
+        <w:rPr/>
+        <w:t>somewhat interactable</w:t>
+      </w:r>
+      <w:r>
+        <w:rPr/>
+        <w:t xml:space="preserve">. </w:t>
+      </w:r>
+    </w:p>
+    <w:p>
+      <w:pPr>
+        <w:jc w:val="both"/>
+      </w:pPr>
+      <w:r>
+        <w:rPr/>
+        <w:t xml:space="preserve">For example, when we create the helpdesk page, </w:t>
+      </w:r>
+      <w:r>
+        <w:rPr/>
+        <w:t>it</w:t>
+      </w:r>
+      <w:r>
+        <w:rPr/>
+        <w:t xml:space="preserve"> </w:t>
+      </w:r>
+      <w:r>
+        <w:rPr/>
+        <w:t>wo</w:t>
+      </w:r>
+      <w:r>
+        <w:rPr/>
+        <w:t>n’t</w:t>
+      </w:r>
+      <w:r>
+        <w:rPr/>
+        <w:t xml:space="preserve"> be as</w:t>
+      </w:r>
+      <w:r>
+        <w:rPr/>
+        <w:t>king for any student</w:t>
+      </w:r>
+      <w:r>
+        <w:rPr/>
+        <w:t xml:space="preserve"> </w:t>
+      </w:r>
+      <w:r>
+        <w:rPr/>
+        <w:t>information</w:t>
+      </w:r>
+      <w:r>
+        <w:rPr/>
+        <w:t>;</w:t>
+      </w:r>
+      <w:r>
+        <w:rPr/>
+        <w:t xml:space="preserve"> </w:t>
+      </w:r>
+      <w:r>
+        <w:rPr/>
+        <w:t>there will</w:t>
+      </w:r>
+      <w:r>
+        <w:rPr/>
+        <w:t xml:space="preserve"> just be a </w:t>
+      </w:r>
+      <w:r>
+        <w:rPr/>
+        <w:t>drop-down</w:t>
+      </w:r>
+      <w:r>
+        <w:rPr/>
+        <w:t xml:space="preserve"> menu </w:t>
+      </w:r>
+      <w:r>
+        <w:rPr/>
+        <w:t>option</w:t>
+      </w:r>
+      <w:r>
+        <w:rPr/>
+        <w:t xml:space="preserve"> to choose the issue and a</w:t>
+      </w:r>
+      <w:r>
+        <w:rPr/>
+        <w:t>n area</w:t>
+      </w:r>
+      <w:r>
+        <w:rPr/>
+        <w:t xml:space="preserve"> to</w:t>
+      </w:r>
+      <w:r>
+        <w:rPr/>
+        <w:t xml:space="preserve"> type </w:t>
+      </w:r>
+      <w:r>
+        <w:rPr/>
+        <w:t>a short descr</w:t>
+      </w:r>
+      <w:r>
+        <w:rPr/>
+        <w:t>iption</w:t>
+      </w:r>
+      <w:r>
+        <w:rPr/>
+        <w:t xml:space="preserve">. </w:t>
+      </w:r>
+    </w:p>
+    <w:p>
+      <w:pPr>
+        <w:jc w:val="both"/>
+      </w:pPr>
+      <w:r>
+        <w:rPr/>
+        <w:t xml:space="preserve">For the timetable, we will make it so there will be </w:t>
+      </w:r>
+      <w:r>
+        <w:rPr/>
+        <w:t>an option</w:t>
+      </w:r>
+      <w:r>
+        <w:rPr/>
+        <w:t xml:space="preserve"> to choose what group </w:t>
+      </w:r>
+      <w:r>
+        <w:rPr/>
+        <w:t>you're</w:t>
+      </w:r>
+      <w:r>
+        <w:rPr/>
+        <w:t xml:space="preserve"> in</w:t>
+      </w:r>
+      <w:r>
+        <w:rPr/>
+        <w:t>,</w:t>
+      </w:r>
+      <w:r>
+        <w:rPr/>
+        <w:t xml:space="preserve"> and a specified made</w:t>
+      </w:r>
+      <w:r>
+        <w:rPr/>
+        <w:t>-</w:t>
+      </w:r>
+      <w:r>
+        <w:rPr/>
+        <w:t xml:space="preserve">up </w:t>
+      </w:r>
+      <w:r>
+        <w:rPr/>
+        <w:t>timetable</w:t>
+      </w:r>
+      <w:r>
+        <w:rPr/>
+        <w:t xml:space="preserve"> for that </w:t>
+      </w:r>
+      <w:r>
+        <w:rPr/>
+        <w:t xml:space="preserve">group will appear. </w:t>
+      </w:r>
+      <w:r>
+        <w:rPr/>
+        <w:t>No</w:t>
+      </w:r>
+      <w:r>
+        <w:rPr/>
+        <w:t xml:space="preserve"> </w:t>
+      </w:r>
+      <w:r>
+        <w:rPr/>
+        <w:t>personal</w:t>
+      </w:r>
+      <w:r>
+        <w:rPr/>
+        <w:t xml:space="preserve"> student info will be needed. </w:t>
+      </w:r>
+    </w:p>
+    <w:p>
+      <w:pPr>
+        <w:jc w:val="both"/>
+      </w:pPr>
+      <w:r>
+        <w:rPr/>
+        <w:t xml:space="preserve">For the map, it will only display the area of the fake college with markers randomly placed labelling a building name. </w:t>
+      </w:r>
+      <w:r>
+        <w:rPr/>
+        <w:t xml:space="preserve">The application </w:t>
+      </w:r>
+      <w:r>
+        <w:rPr/>
+        <w:t>won't</w:t>
+      </w:r>
+      <w:r>
+        <w:rPr/>
+        <w:t xml:space="preserve"> be asking for a student's location.</w:t>
+      </w:r>
+    </w:p>
+    <w:p>
+      <w:pPr>
         <w:pStyle w:val="Normal"/>
         <w:jc w:val="both"/>
       </w:pPr>
       <w:r>
         <w:rPr/>
-        <w:t>System design: Inputs, Processes, Outputs (IPO)</w:t>
+        <w:t xml:space="preserve">For the lost and found page, we will only </w:t>
+      </w:r>
+      <w:r>
+        <w:rPr/>
+        <w:t>add</w:t>
+      </w:r>
+      <w:r>
+        <w:rPr/>
+        <w:t xml:space="preserve"> </w:t>
+      </w:r>
+      <w:r>
+        <w:rPr/>
+        <w:t>an option</w:t>
+      </w:r>
+      <w:r>
+        <w:rPr/>
+        <w:t xml:space="preserve"> to </w:t>
+      </w:r>
+      <w:r>
+        <w:rPr/>
+        <w:t>describe</w:t>
+      </w:r>
+      <w:r>
+        <w:rPr/>
+        <w:t xml:space="preserve"> the item </w:t>
+      </w:r>
+      <w:r>
+        <w:rPr/>
+        <w:t xml:space="preserve">or </w:t>
+      </w:r>
+      <w:r>
+        <w:rPr/>
+        <w:t xml:space="preserve">display a list of </w:t>
+      </w:r>
+      <w:r>
+        <w:rPr/>
+        <w:t>made-up</w:t>
+      </w:r>
+      <w:r>
+        <w:rPr/>
+        <w:t xml:space="preserve"> items and add a “claim” button. </w:t>
+      </w:r>
+    </w:p>
+    <w:p>
+      <w:pPr>
+        <w:jc w:val="both"/>
+      </w:pPr>
+      <w:r>
+        <w:rPr>
+          <w:b w:val="1"/>
+          <w:bCs w:val="1"/>
+        </w:rPr>
+        <w:t>Usability and UI design decisions (navigation, layout consistency, feedback/messages)</w:t>
+      </w:r>
+    </w:p>
+    <w:p>
+      <w:pPr>
+        <w:jc w:val="both"/>
+      </w:pPr>
+      <w:r>
+        <w:rPr>
+          <w:b w:val="1"/>
+          <w:bCs w:val="1"/>
+        </w:rPr>
+        <w:t>Navigation:</w:t>
       </w:r>
     </w:p>
     <w:p>
       <w:pPr>
         <w:pStyle w:val="Normal"/>
         <w:jc w:val="both"/>
-      </w:pPr>
-      <w:r>
-        <w:rPr/>
-        <w:t>Architecture overview (client, data storage, optional auth, serverless functions if used)</w:t>
+        <w:rPr>
+          <w:b w:val="0"/>
+          <w:bCs w:val="0"/>
+        </w:rPr>
+      </w:pPr>
+      <w:r>
+        <w:rPr>
+          <w:b w:val="0"/>
+          <w:bCs w:val="0"/>
+        </w:rPr>
+        <w:t>The design choices we will implement will be simple for users to easily navigate the application. This will include a navigation bar, buttons on the home page labelled to its destination, clear accessibility like quick links, animations, and user support, etc.</w:t>
+      </w:r>
+    </w:p>
+    <w:p>
+      <w:pPr>
+        <w:jc w:val="both"/>
+      </w:pPr>
+      <w:r>
+        <w:rPr>
+          <w:b w:val="1"/>
+          <w:bCs w:val="1"/>
+        </w:rPr>
+        <w:t>Layout:</w:t>
       </w:r>
     </w:p>
     <w:p>
       <w:pPr>
         <w:pStyle w:val="Normal"/>
         <w:jc w:val="both"/>
-      </w:pPr>
-      <w:r>
-        <w:rPr/>
-        <w:t xml:space="preserve">Data design (conceptual): key entities and relationships; what you will NOT collect (data </w:t>
+        <w:rPr>
+          <w:b w:val="0"/>
+          <w:bCs w:val="0"/>
+        </w:rPr>
+      </w:pPr>
+      <w:r>
+        <w:rPr>
+          <w:b w:val="0"/>
+          <w:bCs w:val="0"/>
+        </w:rPr>
+        <w:t xml:space="preserve">The layout will be consistent </w:t>
+      </w:r>
+      <w:r>
+        <w:rPr>
+          <w:b w:val="0"/>
+          <w:bCs w:val="0"/>
+        </w:rPr>
+        <w:t xml:space="preserve">throughout the entire application displaying </w:t>
+      </w:r>
+      <w:r>
+        <w:rPr>
+          <w:b w:val="0"/>
+          <w:bCs w:val="0"/>
+        </w:rPr>
+        <w:t xml:space="preserve">a consistent white, blue and grey </w:t>
+      </w:r>
+      <w:r>
+        <w:rPr>
+          <w:b w:val="0"/>
+          <w:bCs w:val="0"/>
+        </w:rPr>
+        <w:t>colour</w:t>
+      </w:r>
+      <w:r>
+        <w:rPr>
+          <w:b w:val="0"/>
+          <w:bCs w:val="0"/>
+        </w:rPr>
+        <w:t xml:space="preserve"> </w:t>
+      </w:r>
+      <w:r>
+        <w:rPr>
+          <w:b w:val="0"/>
+          <w:bCs w:val="0"/>
+        </w:rPr>
+        <w:t>scheme;</w:t>
+      </w:r>
+      <w:r>
+        <w:rPr>
+          <w:b w:val="0"/>
+          <w:bCs w:val="0"/>
+        </w:rPr>
+        <w:t xml:space="preserve"> the font and sizes of text </w:t>
+      </w:r>
+      <w:r>
+        <w:rPr>
+          <w:b w:val="0"/>
+          <w:bCs w:val="0"/>
+        </w:rPr>
+        <w:t xml:space="preserve">will </w:t>
+      </w:r>
+      <w:r>
+        <w:rPr>
+          <w:b w:val="0"/>
+          <w:bCs w:val="0"/>
+        </w:rPr>
+        <w:t xml:space="preserve">stay the same on every page, </w:t>
+      </w:r>
+      <w:r>
+        <w:rPr>
+          <w:b w:val="0"/>
+          <w:bCs w:val="0"/>
+        </w:rPr>
+        <w:t xml:space="preserve">and it is compatible for those on a phone. </w:t>
       </w:r>
     </w:p>
     <w:p>
       <w:pPr>
         <w:pStyle w:val="Normal"/>
         <w:jc w:val="both"/>
-      </w:pPr>
-      <w:r>
-        <w:rPr/>
-        <w:t>minimisation)</w:t>
+        <w:rPr>
+          <w:b w:val="1"/>
+          <w:bCs w:val="1"/>
+        </w:rPr>
+      </w:pPr>
+      <w:r>
+        <w:rPr>
+          <w:b w:val="1"/>
+          <w:bCs w:val="1"/>
+        </w:rPr>
+        <w:t>Feedback/Messages</w:t>
       </w:r>
     </w:p>
     <w:p>
       <w:pPr>
         <w:pStyle w:val="Normal"/>
         <w:jc w:val="both"/>
-      </w:pPr>
-      <w:r>
-        <w:rPr/>
-        <w:t>Usability and UI design decisions (navigation, layout consistency, feedback/messages)</w:t>
-      </w:r>
-    </w:p>
-    <w:p>
-      <w:pPr>
-        <w:pStyle w:val="Normal"/>
-        <w:jc w:val="both"/>
-      </w:pPr>
-      <w:r>
-        <w:rPr/>
+        <w:rPr>
+          <w:b w:val="0"/>
+          <w:bCs w:val="0"/>
+        </w:rPr>
+      </w:pPr>
+      <w:r>
+        <w:rPr>
+          <w:b w:val="0"/>
+          <w:bCs w:val="0"/>
+        </w:rPr>
+        <w:t>Users will also be given feedback based on their actions</w:t>
+      </w:r>
+      <w:r>
+        <w:rPr>
+          <w:b w:val="0"/>
+          <w:bCs w:val="0"/>
+        </w:rPr>
+        <w:t>. There</w:t>
+      </w:r>
+      <w:r>
+        <w:rPr>
+          <w:b w:val="0"/>
+          <w:bCs w:val="0"/>
+        </w:rPr>
+        <w:t xml:space="preserve"> will be animations when clicking buttons, for example a hover effect </w:t>
+      </w:r>
+      <w:r>
+        <w:rPr>
+          <w:b w:val="0"/>
+          <w:bCs w:val="0"/>
+        </w:rPr>
+        <w:t xml:space="preserve">causing a pop out animation or a dark </w:t>
+      </w:r>
+      <w:r>
+        <w:rPr>
+          <w:b w:val="0"/>
+          <w:bCs w:val="0"/>
+        </w:rPr>
+        <w:t>blue box surrounding the text in the navbar</w:t>
+      </w:r>
+      <w:r>
+        <w:rPr>
+          <w:b w:val="0"/>
+          <w:bCs w:val="0"/>
+        </w:rPr>
+        <w:t xml:space="preserve"> indicating that </w:t>
+      </w:r>
+      <w:r>
+        <w:rPr>
+          <w:b w:val="0"/>
+          <w:bCs w:val="0"/>
+        </w:rPr>
+        <w:t>it's</w:t>
+      </w:r>
+      <w:r>
+        <w:rPr>
+          <w:b w:val="0"/>
+          <w:bCs w:val="0"/>
+        </w:rPr>
+        <w:t xml:space="preserve"> been interacted with. An example of messages being returned would </w:t>
+      </w:r>
+      <w:r>
+        <w:rPr>
+          <w:b w:val="0"/>
+          <w:bCs w:val="0"/>
+        </w:rPr>
+        <w:t>be on the lost and found page</w:t>
+      </w:r>
+      <w:r>
+        <w:rPr>
+          <w:b w:val="0"/>
+          <w:bCs w:val="0"/>
+        </w:rPr>
+        <w:t>. If the user</w:t>
+      </w:r>
+      <w:r>
+        <w:rPr>
+          <w:b w:val="0"/>
+          <w:bCs w:val="0"/>
+        </w:rPr>
+        <w:t xml:space="preserve"> pres</w:t>
+      </w:r>
+      <w:r>
+        <w:rPr>
+          <w:b w:val="0"/>
+          <w:bCs w:val="0"/>
+        </w:rPr>
+        <w:t>ses</w:t>
+      </w:r>
+      <w:r>
+        <w:rPr>
+          <w:b w:val="0"/>
+          <w:bCs w:val="0"/>
+        </w:rPr>
+        <w:t xml:space="preserve"> “Claim</w:t>
+      </w:r>
+      <w:r>
+        <w:rPr>
+          <w:b w:val="0"/>
+          <w:bCs w:val="0"/>
+        </w:rPr>
+        <w:t>”,</w:t>
+      </w:r>
+      <w:r>
+        <w:rPr>
+          <w:b w:val="0"/>
+          <w:bCs w:val="0"/>
+        </w:rPr>
+        <w:t xml:space="preserve"> it will turn grey with text “Claim requested” preventing them from cl</w:t>
+      </w:r>
+      <w:r>
+        <w:rPr>
+          <w:b w:val="0"/>
+          <w:bCs w:val="0"/>
+        </w:rPr>
+        <w:t xml:space="preserve">icking it again. </w:t>
+      </w:r>
+    </w:p>
+    <w:p>
+      <w:pPr>
+        <w:jc w:val="both"/>
+        <w:rPr>
+          <w:b w:val="1"/>
+          <w:bCs w:val="1"/>
+        </w:rPr>
+      </w:pPr>
+    </w:p>
+    <w:p>
+      <w:pPr>
+        <w:jc w:val="both"/>
+      </w:pPr>
+      <w:r>
         <w:t xml:space="preserve">Accessibility plan (WCAG-aligned decisions: headings, labels, keyboard navigation, focus </w:t>
       </w:r>
     </w:p>
     <w:p>
       <w:pPr>
-        <w:pStyle w:val="Normal"/>
-        <w:jc w:val="both"/>
-      </w:pPr>
-      <w:r>
-        <w:rPr/>
+        <w:jc w:val="both"/>
+      </w:pPr>
+      <w:r>
         <w:t>states, contrast)</w:t>
       </w:r>
     </w:p>
     <w:p>
       <w:pPr>
-        <w:pStyle w:val="Normal"/>
-        <w:jc w:val="both"/>
-      </w:pPr>
-      <w:r>
-        <w:rPr/>
-        <w:t xml:space="preserve">Privacy, security, and compliance (GDPR basics: lawful basis conceptually, </w:t>
-      </w:r>
-      <w:r>
-        <w:rPr/>
-        <w:t>minimisation</w:t>
-      </w:r>
-      <w:r>
-        <w:rPr/>
-        <w:t xml:space="preserve">, </w:t>
-      </w:r>
-    </w:p>
-    <w:p>
-      <w:pPr>
-        <w:pStyle w:val="Normal"/>
-        <w:jc w:val="both"/>
-      </w:pPr>
-      <w:r>
-        <w:rPr/>
+        <w:jc w:val="both"/>
+      </w:pPr>
+      <w:r>
+        <w:t xml:space="preserve">Privacy, security, and compliance (GDPR basics: lawful basis conceptually, minimisation, </w:t>
+      </w:r>
+    </w:p>
+    <w:p>
+      <w:pPr>
+        <w:jc w:val="both"/>
+      </w:pPr>
+      <w:r>
         <w:t>retention; risks + mitigations)</w:t>
       </w:r>
     </w:p>
     <w:p>
       <w:pPr>
-        <w:pStyle w:val="Normal"/>
-        <w:jc w:val="both"/>
-      </w:pPr>
-      <w:r>
-        <w:rPr/>
+        <w:jc w:val="both"/>
+      </w:pPr>
+      <w:r>
         <w:t>Deployment plan (conceptual)</w:t>
       </w:r>
     </w:p>
     <w:p>
       <w:pPr>
-        <w:pStyle w:val="Normal"/>
-        <w:jc w:val="both"/>
-      </w:pPr>
-      <w:r>
-        <w:rPr/>
+        <w:jc w:val="both"/>
+      </w:pPr>
+      <w:r>
         <w:t>Appendix (wireframes, palette, diagrams, checklists)</w:t>
       </w:r>
     </w:p>
@@ -163,8 +740,19 @@
 </w:document>
 </file>
 
+<file path=word/intelligence2.xml><?xml version="1.0" encoding="utf-8"?>
+<int2:intelligence xmlns:int2="http://schemas.microsoft.com/office/intelligence/2020/intelligence">
+  <int2:observations>
+    <int2:textHash int2:hashCode="edQaR+j+xVhWpq" int2:id="jpSbd53w">
+      <int2:state int2:type="spell" int2:value="Rejected"/>
+    </int2:textHash>
+  </int2:observations>
+  <int2:intelligenceSettings/>
+</int2:intelligence>
+</file>
+
 <file path=word/styles.xml><?xml version="1.0" encoding="utf-8"?>
-<w:styles xmlns:wp14="http://schemas.microsoft.com/office/word/2010/wordprocessingDrawing" xmlns:mc="http://schemas.openxmlformats.org/markup-compatibility/2006" xmlns:r="http://schemas.openxmlformats.org/officeDocument/2006/relationships" xmlns:w="http://schemas.openxmlformats.org/wordprocessingml/2006/main" xmlns:w14="http://schemas.microsoft.com/office/word/2010/wordml" xmlns:w15="http://schemas.microsoft.com/office/word/2012/wordml" xmlns:w16se="http://schemas.microsoft.com/office/word/2015/wordml/symex" xmlns:w16cid="http://schemas.microsoft.com/office/word/2016/wordml/cid" xmlns:w16="http://schemas.microsoft.com/office/word/2018/wordml" xmlns:w16cex="http://schemas.microsoft.com/office/word/2018/wordml/cex" xmlns:w16sdtdh="http://schemas.microsoft.com/office/word/2020/wordml/sdtdatahash" xmlns:w16sdtfl="http://schemas.microsoft.com/office/word/2024/wordml/sdtformatlock" mc:Ignorable="w14 w15 wp14 w16se w16cid w16 w16cex w16sdtdh w16sdtfl">
+<w:styles xmlns:mc="http://schemas.openxmlformats.org/markup-compatibility/2006" xmlns:r="http://schemas.openxmlformats.org/officeDocument/2006/relationships" xmlns:w="http://schemas.openxmlformats.org/wordprocessingml/2006/main" xmlns:w14="http://schemas.microsoft.com/office/word/2010/wordml" xmlns:w15="http://schemas.microsoft.com/office/word/2012/wordml" xmlns:w16cex="http://schemas.microsoft.com/office/word/2018/wordml/cex" xmlns:w16cid="http://schemas.microsoft.com/office/word/2016/wordml/cid" xmlns:w16="http://schemas.microsoft.com/office/word/2018/wordml" xmlns:w16du="http://schemas.microsoft.com/office/word/2023/wordml/word16du" xmlns:w16sdtdh="http://schemas.microsoft.com/office/word/2020/wordml/sdtdatahash" xmlns:w16sdtfl="http://schemas.microsoft.com/office/word/2024/wordml/sdtformatlock" xmlns:w16se="http://schemas.microsoft.com/office/word/2015/wordml/symex" mc:Ignorable="w14 w15 w16se w16cid w16 w16cex w16sdtdh w16sdtfl w16du">
   <w:docDefaults>
     <w:rPrDefault>
       <w:rPr>
@@ -180,7 +768,7 @@
       </w:pPr>
     </w:pPrDefault>
   </w:docDefaults>
-  <w:latentStyles w:defLockedState="0" w:defUIPriority="99" w:defSemiHidden="0" w:defUnhideWhenUsed="0" w:defQFormat="0" w:count="371">
+  <w:latentStyles w:defLockedState="0" w:defUIPriority="99" w:defSemiHidden="0" w:defUnhideWhenUsed="0" w:defQFormat="0" w:count="376">
     <w:lsdException w:name="Normal" w:uiPriority="0" w:qFormat="1"/>
     <w:lsdException w:name="heading 1" w:uiPriority="9" w:qFormat="1"/>
     <w:lsdException w:name="heading 2" w:uiPriority="9" w:semiHidden="1" w:unhideWhenUsed="1" w:qFormat="1"/>
@@ -552,6 +1140,11 @@
     <w:lsdException w:name="List Table 5 Dark Accent 6" w:uiPriority="50"/>
     <w:lsdException w:name="List Table 6 Colorful Accent 6" w:uiPriority="51"/>
     <w:lsdException w:name="List Table 7 Colorful Accent 6" w:uiPriority="52"/>
+    <w:lsdException w:name="Mention" w:semiHidden="1" w:unhideWhenUsed="1"/>
+    <w:lsdException w:name="Smart Hyperlink" w:semiHidden="1" w:unhideWhenUsed="1"/>
+    <w:lsdException w:name="Hashtag" w:semiHidden="1" w:unhideWhenUsed="1"/>
+    <w:lsdException w:name="Unresolved Mention" w:semiHidden="1" w:unhideWhenUsed="1"/>
+    <w:lsdException w:name="Smart Link" w:semiHidden="1" w:unhideWhenUsed="1"/>
   </w:latentStyles>
   <w:style w:type="paragraph" w:styleId="Normal" w:default="1">
     <w:name w:val="Normal"/>
@@ -588,7 +1181,7 @@
 </file>
 
 <file path=word/theme/theme1.xml><?xml version="1.0" encoding="utf-8"?>
-<a:theme xmlns:thm15="http://schemas.microsoft.com/office/thememl/2012/main" xmlns:a="http://schemas.openxmlformats.org/drawingml/2006/main" name="Office Theme">
+<a:theme xmlns:a="http://schemas.openxmlformats.org/drawingml/2006/main" xmlns:thm15="http://schemas.microsoft.com/office/thememl/2012/main" name="Office Theme">
   <a:themeElements>
     <a:clrScheme name="Office">
       <a:dk1>

</xml_diff>

<commit_message>
did headings 3 & 4
</commit_message>
<xml_diff>
--- a/Report1.docx
+++ b/Report1.docx
@@ -5,55 +5,362 @@
     <w:p>
       <w:pPr>
         <w:jc w:val="center"/>
-      </w:pPr>
-      <w:r>
+        <w:rPr>
+          <w:b/>
+          <w:bCs/>
+          <w:sz w:val="40"/>
+          <w:szCs w:val="40"/>
+          <w:u w:val="single"/>
+        </w:rPr>
+      </w:pPr>
+      <w:r>
+        <w:rPr>
+          <w:b/>
+          <w:bCs/>
+          <w:sz w:val="40"/>
+          <w:szCs w:val="40"/>
+          <w:u w:val="single"/>
+        </w:rPr>
         <w:t>DESIGN REPORT</w:t>
       </w:r>
     </w:p>
     <w:p>
       <w:pPr>
         <w:jc w:val="both"/>
-      </w:pPr>
-      <w:r>
+        <w:rPr>
+          <w:b/>
+          <w:bCs/>
+          <w:sz w:val="28"/>
+          <w:szCs w:val="28"/>
+          <w:u w:val="single"/>
+        </w:rPr>
+      </w:pPr>
+      <w:r>
+        <w:rPr>
+          <w:b/>
+          <w:bCs/>
+          <w:sz w:val="28"/>
+          <w:szCs w:val="28"/>
+          <w:u w:val="single"/>
+        </w:rPr>
         <w:t>Project overview and problem statement</w:t>
       </w:r>
-    </w:p>
-    <w:p>
-      <w:pPr>
-        <w:jc w:val="both"/>
-      </w:pPr>
-      <w:r>
+      <w:r>
+        <w:rPr>
+          <w:b/>
+          <w:bCs/>
+          <w:sz w:val="28"/>
+          <w:szCs w:val="28"/>
+          <w:u w:val="single"/>
+        </w:rPr>
+        <w:t>:</w:t>
+      </w:r>
+    </w:p>
+    <w:p>
+      <w:pPr>
+        <w:jc w:val="both"/>
+        <w:rPr>
+          <w:b/>
+          <w:bCs/>
+          <w:sz w:val="28"/>
+          <w:szCs w:val="28"/>
+          <w:u w:val="single"/>
+        </w:rPr>
+      </w:pPr>
+    </w:p>
+    <w:p>
+      <w:pPr>
+        <w:jc w:val="both"/>
+        <w:rPr>
+          <w:b/>
+          <w:bCs/>
+          <w:sz w:val="28"/>
+          <w:szCs w:val="28"/>
+          <w:u w:val="single"/>
+        </w:rPr>
+      </w:pPr>
+      <w:r>
+        <w:rPr>
+          <w:b/>
+          <w:bCs/>
+          <w:sz w:val="28"/>
+          <w:szCs w:val="28"/>
+          <w:u w:val="single"/>
+        </w:rPr>
         <w:t>Target users and user needs (personas)</w:t>
       </w:r>
-    </w:p>
-    <w:p>
-      <w:pPr>
-        <w:jc w:val="both"/>
-      </w:pPr>
-      <w:r>
+      <w:r>
+        <w:rPr>
+          <w:b/>
+          <w:bCs/>
+          <w:sz w:val="28"/>
+          <w:szCs w:val="28"/>
+          <w:u w:val="single"/>
+        </w:rPr>
+        <w:t>:</w:t>
+      </w:r>
+    </w:p>
+    <w:p>
+      <w:pPr>
+        <w:jc w:val="both"/>
+        <w:rPr>
+          <w:b/>
+          <w:bCs/>
+          <w:sz w:val="28"/>
+          <w:szCs w:val="28"/>
+          <w:u w:val="single"/>
+        </w:rPr>
+      </w:pPr>
+    </w:p>
+    <w:p>
+      <w:pPr>
+        <w:jc w:val="both"/>
+        <w:rPr>
+          <w:b/>
+          <w:bCs/>
+          <w:sz w:val="28"/>
+          <w:szCs w:val="28"/>
+          <w:u w:val="single"/>
+        </w:rPr>
+      </w:pPr>
+      <w:r>
+        <w:rPr>
+          <w:b/>
+          <w:bCs/>
+          <w:sz w:val="28"/>
+          <w:szCs w:val="28"/>
+          <w:u w:val="single"/>
+        </w:rPr>
         <w:t>System design: Inputs, Processes, Outputs (IPO)</w:t>
       </w:r>
-    </w:p>
-    <w:p>
-      <w:pPr>
-        <w:jc w:val="both"/>
-      </w:pPr>
-      <w:r>
+      <w:r>
+        <w:rPr>
+          <w:b/>
+          <w:bCs/>
+          <w:sz w:val="28"/>
+          <w:szCs w:val="28"/>
+          <w:u w:val="single"/>
+        </w:rPr>
+        <w:t>:</w:t>
+      </w:r>
+    </w:p>
+    <w:p>
+      <w:pPr>
+        <w:jc w:val="both"/>
+        <w:rPr>
+          <w:lang w:val="en-GB"/>
+        </w:rPr>
+      </w:pPr>
+      <w:r>
+        <w:t>Campus Companion app is built to assist students with their daily activities and provide support to any problem that occurs.</w:t>
+      </w:r>
+      <w:r>
+        <w:rPr>
+          <w:lang w:val="en-GB"/>
+        </w:rPr>
+        <w:t> </w:t>
+      </w:r>
+    </w:p>
+    <w:p>
+      <w:pPr>
+        <w:jc w:val="both"/>
+        <w:rPr>
+          <w:lang w:val="en-GB"/>
+        </w:rPr>
+      </w:pPr>
+      <w:r>
+        <w:t>The system’s inputs are data entered into the system by the user (students), these include personal information like name, date of birth etc., preferences like college activities and societies. These inputs helps the system create a personalized experience for the users.</w:t>
+      </w:r>
+      <w:r>
+        <w:rPr>
+          <w:lang w:val="en-GB"/>
+        </w:rPr>
+        <w:t> </w:t>
+      </w:r>
+    </w:p>
+    <w:p>
+      <w:pPr>
+        <w:jc w:val="both"/>
+        <w:rPr>
+          <w:lang w:val="en-GB"/>
+        </w:rPr>
+      </w:pPr>
+      <w:r>
+        <w:t>The system process is how the system handles requests made by the users, like requesting for timetables or searching for an events on campus. For features like reminders or recommendations the system uses the user preferences to give personalized results.</w:t>
+      </w:r>
+      <w:r>
+        <w:rPr>
+          <w:lang w:val="en-GB"/>
+        </w:rPr>
+        <w:t> </w:t>
+      </w:r>
+    </w:p>
+    <w:p>
+      <w:pPr>
+        <w:jc w:val="both"/>
+        <w:rPr>
+          <w:lang w:val="en-GB"/>
+        </w:rPr>
+      </w:pPr>
+      <w:r>
+        <w:t>The system’s outputs are results given to the user from the system. These can include the student’s timetable, personalized recommendations and confirmation messages. Outputs are meant to be clear, easily understandable, and respond to the information provided by the users.</w:t>
+      </w:r>
+      <w:r>
+        <w:rPr>
+          <w:lang w:val="en-GB"/>
+        </w:rPr>
+        <w:t> </w:t>
+      </w:r>
+    </w:p>
+    <w:p>
+      <w:pPr>
+        <w:jc w:val="both"/>
+        <w:rPr>
+          <w:b/>
+          <w:bCs/>
+          <w:sz w:val="28"/>
+          <w:szCs w:val="28"/>
+          <w:u w:val="single"/>
+        </w:rPr>
+      </w:pPr>
+      <w:r>
+        <w:rPr>
+          <w:b/>
+          <w:bCs/>
+          <w:sz w:val="28"/>
+          <w:szCs w:val="28"/>
+          <w:u w:val="single"/>
+        </w:rPr>
         <w:t>Architecture overview (client, data storage, optional auth, serverless functions if used)</w:t>
       </w:r>
-    </w:p>
-    <w:p>
-      <w:pPr>
-        <w:jc w:val="both"/>
-        <w:rPr>
-          <w:b/>
-          <w:bCs/>
-        </w:rPr>
-      </w:pPr>
-      <w:r>
-        <w:rPr>
-          <w:b/>
-          <w:bCs/>
+      <w:r>
+        <w:rPr>
+          <w:b/>
+          <w:bCs/>
+          <w:sz w:val="28"/>
+          <w:szCs w:val="28"/>
+          <w:u w:val="single"/>
+        </w:rPr>
+        <w:t>:</w:t>
+      </w:r>
+    </w:p>
+    <w:p>
+      <w:pPr>
+        <w:jc w:val="both"/>
+        <w:rPr>
+          <w:lang w:val="en-GB"/>
+        </w:rPr>
+      </w:pPr>
+      <w:r>
+        <w:t>The system uses a web-based architecture with a client-server model. The client side is built using ‘Next.js’ a react framework which helps us handle the users interface and user interactions, it runs in the web browser and it also communicate with the backend services through API calls.</w:t>
+      </w:r>
+      <w:r>
+        <w:rPr>
+          <w:lang w:val="en-GB"/>
+        </w:rPr>
+        <w:t> </w:t>
+      </w:r>
+    </w:p>
+    <w:p>
+      <w:pPr>
+        <w:jc w:val="both"/>
+        <w:rPr>
+          <w:lang w:val="en-GB"/>
+        </w:rPr>
+      </w:pPr>
+      <w:r>
+        <w:t>The backend uses serverless functions like Netlify  Functions or </w:t>
+      </w:r>
+      <w:proofErr w:type="spellStart"/>
+      <w:r>
+        <w:t>Supabase</w:t>
+      </w:r>
+      <w:proofErr w:type="spellEnd"/>
+      <w:r>
+        <w:t> to process requests made by the user like fetching events dates or submitting forms in the app. This method allows us to reduce the need for managing the servers and allows for more scalable and efficient handling of requests made by users.</w:t>
+      </w:r>
+      <w:r>
+        <w:rPr>
+          <w:lang w:val="en-GB"/>
+        </w:rPr>
+        <w:t> </w:t>
+      </w:r>
+    </w:p>
+    <w:p>
+      <w:pPr>
+        <w:jc w:val="both"/>
+        <w:rPr>
+          <w:lang w:val="en-GB"/>
+        </w:rPr>
+      </w:pPr>
+      <w:r>
+        <w:lastRenderedPageBreak/>
+        <w:t>The system uses </w:t>
+      </w:r>
+      <w:proofErr w:type="spellStart"/>
+      <w:r>
+        <w:t>Supabase</w:t>
+      </w:r>
+      <w:proofErr w:type="spellEnd"/>
+      <w:r>
+        <w:t> for the database, where we store fictional data like users, timetables, events, helpdesk tickets and lost &amp; found. The database is made for fast queries and data handling.</w:t>
+      </w:r>
+      <w:r>
+        <w:rPr>
+          <w:lang w:val="en-GB"/>
+        </w:rPr>
+        <w:t> </w:t>
+      </w:r>
+    </w:p>
+    <w:p>
+      <w:pPr>
+        <w:jc w:val="both"/>
+        <w:rPr>
+          <w:lang w:val="en-GB"/>
+        </w:rPr>
+      </w:pPr>
+      <w:r>
+        <w:t>The system will also include authentication to give</w:t>
+      </w:r>
+      <w:r>
+        <w:t xml:space="preserve"> </w:t>
+      </w:r>
+      <w:r>
+        <w:t>the user’s a more </w:t>
+      </w:r>
+      <w:proofErr w:type="spellStart"/>
+      <w:r>
+        <w:t>personalised</w:t>
+      </w:r>
+      <w:proofErr w:type="spellEnd"/>
+      <w:r>
+        <w:t> experience even though it can function without it.</w:t>
+      </w:r>
+      <w:r>
+        <w:rPr>
+          <w:lang w:val="en-GB"/>
+        </w:rPr>
+        <w:t> </w:t>
+      </w:r>
+    </w:p>
+    <w:p>
+      <w:pPr>
+        <w:jc w:val="both"/>
+        <w:rPr>
+          <w:b/>
+          <w:bCs/>
+          <w:sz w:val="28"/>
+          <w:szCs w:val="28"/>
+          <w:u w:val="single"/>
+        </w:rPr>
+      </w:pPr>
+      <w:r>
+        <w:rPr>
+          <w:b/>
+          <w:bCs/>
+          <w:sz w:val="28"/>
+          <w:szCs w:val="28"/>
+          <w:u w:val="single"/>
         </w:rPr>
         <w:t xml:space="preserve">Data design (conceptual): key entities and relationships; what you will NOT collect (data </w:t>
       </w:r>
@@ -61,6 +368,9 @@
         <w:rPr>
           <w:b/>
           <w:bCs/>
+          <w:sz w:val="28"/>
+          <w:szCs w:val="28"/>
+          <w:u w:val="single"/>
         </w:rPr>
         <w:t>minimization</w:t>
       </w:r>
@@ -68,9 +378,22 @@
         <w:rPr>
           <w:b/>
           <w:bCs/>
+          <w:sz w:val="28"/>
+          <w:szCs w:val="28"/>
+          <w:u w:val="single"/>
         </w:rPr>
         <w:t>)</w:t>
       </w:r>
+      <w:r>
+        <w:rPr>
+          <w:b/>
+          <w:bCs/>
+          <w:sz w:val="28"/>
+          <w:szCs w:val="28"/>
+          <w:u w:val="single"/>
+        </w:rPr>
+        <w:t>:</w:t>
+      </w:r>
     </w:p>
     <w:p>
       <w:pPr>
@@ -264,13 +587,31 @@
     <w:p>
       <w:pPr>
         <w:jc w:val="both"/>
-      </w:pPr>
-      <w:r>
-        <w:rPr>
-          <w:b/>
-          <w:bCs/>
+        <w:rPr>
+          <w:sz w:val="28"/>
+          <w:szCs w:val="28"/>
+          <w:u w:val="single"/>
+        </w:rPr>
+      </w:pPr>
+      <w:r>
+        <w:rPr>
+          <w:b/>
+          <w:bCs/>
+          <w:sz w:val="28"/>
+          <w:szCs w:val="28"/>
+          <w:u w:val="single"/>
         </w:rPr>
         <w:t>Usability and UI design decisions (navigation, layout consistency, feedback/messages)</w:t>
+      </w:r>
+      <w:r>
+        <w:rPr>
+          <w:b/>
+          <w:bCs/>
+          <w:sz w:val="28"/>
+          <w:szCs w:val="28"/>
+          <w:u w:val="single"/>
+        </w:rPr>
+        <w:t>:</w:t>
       </w:r>
     </w:p>
     <w:p>
@@ -418,55 +759,124 @@
     <w:p>
       <w:pPr>
         <w:jc w:val="both"/>
-      </w:pPr>
-      <w:r>
-        <w:t xml:space="preserve">Accessibility plan (WCAG-aligned decisions: headings, labels, keyboard navigation, focus </w:t>
-      </w:r>
-    </w:p>
-    <w:p>
-      <w:pPr>
-        <w:jc w:val="both"/>
-      </w:pPr>
-      <w:r>
-        <w:t>states, contrast)</w:t>
-      </w:r>
-    </w:p>
-    <w:p>
-      <w:pPr>
-        <w:jc w:val="both"/>
-      </w:pPr>
-      <w:r>
+        <w:rPr>
+          <w:b/>
+          <w:bCs/>
+          <w:sz w:val="28"/>
+          <w:szCs w:val="28"/>
+        </w:rPr>
+      </w:pPr>
+      <w:r>
+        <w:rPr>
+          <w:b/>
+          <w:bCs/>
+          <w:sz w:val="28"/>
+          <w:szCs w:val="28"/>
+        </w:rPr>
+        <w:t>Accessibility plan (WCAG-aligned decisions: headings, labels, keyboard navigation, focus states, contrast)</w:t>
+      </w:r>
+      <w:r>
+        <w:rPr>
+          <w:b/>
+          <w:bCs/>
+          <w:sz w:val="28"/>
+          <w:szCs w:val="28"/>
+        </w:rPr>
+        <w:t>:</w:t>
+      </w:r>
+    </w:p>
+    <w:p>
+      <w:pPr>
+        <w:jc w:val="both"/>
+      </w:pPr>
+    </w:p>
+    <w:p>
+      <w:pPr>
+        <w:jc w:val="both"/>
+        <w:rPr>
+          <w:b/>
+          <w:bCs/>
+          <w:sz w:val="28"/>
+          <w:szCs w:val="28"/>
+        </w:rPr>
+      </w:pPr>
+      <w:r>
+        <w:rPr>
+          <w:b/>
+          <w:bCs/>
+          <w:sz w:val="28"/>
+          <w:szCs w:val="28"/>
+        </w:rPr>
         <w:t xml:space="preserve">Privacy, security, and compliance (GDPR basics: lawful basis conceptually, </w:t>
       </w:r>
       <w:proofErr w:type="spellStart"/>
       <w:r>
+        <w:rPr>
+          <w:b/>
+          <w:bCs/>
+          <w:sz w:val="28"/>
+          <w:szCs w:val="28"/>
+        </w:rPr>
         <w:t>minimisation</w:t>
       </w:r>
       <w:proofErr w:type="spellEnd"/>
       <w:r>
-        <w:t xml:space="preserve">, </w:t>
-      </w:r>
-    </w:p>
-    <w:p>
-      <w:pPr>
-        <w:jc w:val="both"/>
-      </w:pPr>
-      <w:r>
-        <w:t>retention; risks + mitigations)</w:t>
-      </w:r>
-    </w:p>
-    <w:p>
-      <w:pPr>
-        <w:jc w:val="both"/>
-      </w:pPr>
-    </w:p>
-    <w:p>
-      <w:pPr>
-        <w:jc w:val="both"/>
-      </w:pPr>
-      <w:r>
+        <w:rPr>
+          <w:b/>
+          <w:bCs/>
+          <w:sz w:val="28"/>
+          <w:szCs w:val="28"/>
+        </w:rPr>
+        <w:t>, retention; risks + mitigations)</w:t>
+      </w:r>
+      <w:r>
+        <w:rPr>
+          <w:b/>
+          <w:bCs/>
+          <w:sz w:val="28"/>
+          <w:szCs w:val="28"/>
+        </w:rPr>
+        <w:t>:</w:t>
+      </w:r>
+    </w:p>
+    <w:p>
+      <w:pPr>
+        <w:jc w:val="both"/>
+      </w:pPr>
+    </w:p>
+    <w:p>
+      <w:pPr>
+        <w:jc w:val="both"/>
+        <w:rPr>
+          <w:b/>
+          <w:bCs/>
+          <w:sz w:val="28"/>
+          <w:szCs w:val="28"/>
+        </w:rPr>
+      </w:pPr>
+      <w:r>
+        <w:rPr>
+          <w:b/>
+          <w:bCs/>
+          <w:sz w:val="28"/>
+          <w:szCs w:val="28"/>
+        </w:rPr>
         <w:t>Deployment plan (conceptual)</w:t>
       </w:r>
+      <w:r>
+        <w:rPr>
+          <w:b/>
+          <w:bCs/>
+          <w:sz w:val="28"/>
+          <w:szCs w:val="28"/>
+        </w:rPr>
+        <w:t>:</w:t>
+      </w:r>
+    </w:p>
+    <w:p>
+      <w:pPr>
+        <w:jc w:val="both"/>
+      </w:pPr>
     </w:p>
     <w:p>
       <w:pPr>
@@ -643,7 +1053,6 @@
         <w:rPr>
           <w:lang w:val="en-IE"/>
         </w:rPr>
-        <w:lastRenderedPageBreak/>
         <w:t>The Development stage:</w:t>
       </w:r>
     </w:p>
@@ -896,6 +1305,7 @@
         <w:rPr>
           <w:lang w:val="en-IE"/>
         </w:rPr>
+        <w:lastRenderedPageBreak/>
         <w:br/>
       </w:r>
       <w:r>
@@ -908,7 +1318,6 @@
         <w:rPr>
           <w:lang w:val="en-IE"/>
         </w:rPr>
-        <w:lastRenderedPageBreak/>
         <w:br/>
       </w:r>
       <w:r>

</xml_diff>

<commit_message>
added datebase file, updated design report, some chnages on the app
</commit_message>
<xml_diff>
--- a/Report1.docx
+++ b/Report1.docx
@@ -286,7 +286,6 @@
         </w:rPr>
       </w:pPr>
       <w:r>
-        <w:lastRenderedPageBreak/>
         <w:t>The system uses Supabase for the database, where we store fictional data like users, timetables, events, helpdesk tickets and lost &amp; found. The database is made for fast queries and data handling.</w:t>
       </w:r>
       <w:r>
@@ -365,191 +364,826 @@
     <w:p>
       <w:pPr>
         <w:jc w:val="both"/>
-      </w:pPr>
-      <w:r>
-        <w:t xml:space="preserve">The key entities we chose to </w:t>
-      </w:r>
-      <w:r>
-        <w:t>put in</w:t>
-      </w:r>
-      <w:r>
-        <w:t>to</w:t>
-      </w:r>
-      <w:r>
-        <w:t xml:space="preserve"> the application were</w:t>
-      </w:r>
-      <w:r>
-        <w:t xml:space="preserve"> </w:t>
-      </w:r>
-      <w:r>
-        <w:t xml:space="preserve">a canteen menu, </w:t>
-      </w:r>
-      <w:r>
-        <w:t xml:space="preserve">a helpdesk and lost &amp; found page, a map and timetable. </w:t>
-      </w:r>
-    </w:p>
-    <w:p>
-      <w:pPr>
-        <w:jc w:val="both"/>
-      </w:pPr>
-      <w:r>
-        <w:t xml:space="preserve">For data minimization, </w:t>
-      </w:r>
-      <w:r>
-        <w:t xml:space="preserve">we won't </w:t>
-      </w:r>
-      <w:r>
-        <w:t>be collecting</w:t>
-      </w:r>
-      <w:r>
-        <w:t xml:space="preserve"> any personal information that includes a personal email, phone number</w:t>
-      </w:r>
-      <w:r>
-        <w:t>,</w:t>
-      </w:r>
-      <w:r>
-        <w:t xml:space="preserve"> or address. </w:t>
-      </w:r>
-      <w:r>
-        <w:t xml:space="preserve">What the application will be collecting is only the bare minimum, so our </w:t>
-      </w:r>
-      <w:r>
-        <w:t>pages</w:t>
-      </w:r>
-      <w:r>
-        <w:t xml:space="preserve"> can be somewhat interactable. </w:t>
-      </w:r>
-    </w:p>
-    <w:p>
-      <w:pPr>
-        <w:jc w:val="both"/>
-      </w:pPr>
-      <w:r>
-        <w:t xml:space="preserve">For example, when we create the helpdesk page, </w:t>
-      </w:r>
-      <w:r>
-        <w:t>it</w:t>
-      </w:r>
-      <w:r>
-        <w:t xml:space="preserve"> </w:t>
-      </w:r>
-      <w:r>
-        <w:t>won’t</w:t>
-      </w:r>
-      <w:r>
-        <w:t xml:space="preserve"> be asking for any student</w:t>
-      </w:r>
-      <w:r>
-        <w:t xml:space="preserve"> </w:t>
-      </w:r>
-      <w:r>
-        <w:t>information</w:t>
-      </w:r>
-      <w:r>
-        <w:t>;</w:t>
-      </w:r>
-      <w:r>
-        <w:t xml:space="preserve"> </w:t>
-      </w:r>
-      <w:r>
-        <w:t>there will</w:t>
-      </w:r>
-      <w:r>
-        <w:t xml:space="preserve"> just be a </w:t>
-      </w:r>
-      <w:r>
-        <w:t xml:space="preserve">drop-down menu </w:t>
-      </w:r>
-      <w:r>
-        <w:t>option to choose the issue and a</w:t>
-      </w:r>
-      <w:r>
-        <w:t>n area</w:t>
-      </w:r>
-      <w:r>
-        <w:t xml:space="preserve"> to type a short description. </w:t>
-      </w:r>
-    </w:p>
-    <w:p>
-      <w:pPr>
-        <w:jc w:val="both"/>
-      </w:pPr>
-      <w:r>
-        <w:t xml:space="preserve">For the timetable, we will make it so there will be an option to choose what group </w:t>
-      </w:r>
-      <w:r>
-        <w:t>you're</w:t>
-      </w:r>
-      <w:r>
-        <w:t xml:space="preserve"> in</w:t>
-      </w:r>
-      <w:r>
-        <w:t>,</w:t>
-      </w:r>
-      <w:r>
-        <w:t xml:space="preserve"> and a specified made</w:t>
-      </w:r>
-      <w:r>
-        <w:t>-</w:t>
-      </w:r>
-      <w:r>
-        <w:t xml:space="preserve">up </w:t>
-      </w:r>
-      <w:r>
-        <w:t>timetable</w:t>
-      </w:r>
-      <w:r>
-        <w:t xml:space="preserve"> for that </w:t>
-      </w:r>
-      <w:r>
-        <w:t xml:space="preserve">group will appear. </w:t>
-      </w:r>
-      <w:r>
-        <w:t>No</w:t>
-      </w:r>
-      <w:r>
-        <w:t xml:space="preserve"> personal student info will be needed. </w:t>
-      </w:r>
-    </w:p>
-    <w:p>
-      <w:pPr>
-        <w:jc w:val="both"/>
-      </w:pPr>
-      <w:r>
-        <w:t xml:space="preserve">For the map, it will only display the area of the fake college with markers randomly placed labelling a building name. </w:t>
-      </w:r>
-      <w:r>
-        <w:t>The application won't be asking for a student's location.</w:t>
-      </w:r>
-    </w:p>
-    <w:p>
-      <w:pPr>
-        <w:jc w:val="both"/>
-      </w:pPr>
-      <w:r>
-        <w:t xml:space="preserve">For the lost and found page, we will only </w:t>
-      </w:r>
-      <w:r>
-        <w:t>add</w:t>
-      </w:r>
-      <w:r>
-        <w:t xml:space="preserve"> an option to </w:t>
-      </w:r>
-      <w:r>
-        <w:t>describe</w:t>
-      </w:r>
-      <w:r>
-        <w:t xml:space="preserve"> the item </w:t>
-      </w:r>
-      <w:r>
-        <w:t xml:space="preserve">or </w:t>
-      </w:r>
-      <w:r>
-        <w:t>display a list of made-up</w:t>
-      </w:r>
-      <w:r>
-        <w:t xml:space="preserve"> items and add a “claim” button. </w:t>
-      </w:r>
+        <w:rPr>
+          <w:ins w:author="A00020186 Ocean Wojcicki" w:date="2026-04-29T17:51:03.25Z" w16du:dateUtc="2026-04-29T17:51:03.25Z" w:id="1227514816"/>
+        </w:rPr>
+      </w:pPr>
+      <w:ins w:author="A00020186 Ocean Wojcicki" w:date="2026-04-29T17:48:58.962Z" w16du:dateUtc="2026-04-29T17:48:58.962Z" w:id="230400220">
+        <w:r>
+          <w:t xml:space="preserve">The key entities we chose to put into the application were a canteen menu, a helpdesk </w:t>
+        </w:r>
+      </w:ins>
+      <w:ins w:author="A00020186 Ocean Wojcicki" w:date="2026-04-29T17:49:54.881Z" w16du:dateUtc="2026-04-29T17:49:54.881Z" w:id="2091795257">
+        <w:r>
+          <w:t>and lost &amp; found page, a campus map, a timetable, an events page</w:t>
+        </w:r>
+        <w:r>
+          <w:t>, and a setting</w:t>
+        </w:r>
+        <w:r>
+          <w:t xml:space="preserve"> page</w:t>
+        </w:r>
+      </w:ins>
+      <w:ins w:author="A00020186 Ocean Wojcicki" w:date="2026-04-29T17:50:44.092Z" w16du:dateUtc="2026-04-29T17:50:44.092Z" w:id="1195230598">
+        <w:r>
+          <w:t xml:space="preserve">. </w:t>
+        </w:r>
+      </w:ins>
+    </w:p>
+    <w:p>
+      <w:pPr>
+        <w:pStyle w:val="Normal"/>
+        <w:jc w:val="both"/>
+        <w:rPr>
+          <w:ins w:author="A00020186 Ocean Wojcicki" w:date="2026-04-29T18:16:59.824Z" w16du:dateUtc="2026-04-29T18:16:59.824Z" w:id="1948573410"/>
+        </w:rPr>
+      </w:pPr>
+      <w:ins w:author="A00020186 Ocean Wojcicki" w:date="2026-04-29T17:51:58.958Z" w16du:dateUtc="2026-04-29T17:51:58.958Z" w:id="369342102">
+        <w:r>
+          <w:t xml:space="preserve">For data minimization, we </w:t>
+        </w:r>
+      </w:ins>
+      <w:ins w:author="A00020186 Ocean Wojcicki" w:date="2026-04-29T18:50:04.792Z" w16du:dateUtc="2026-04-29T18:50:04.792Z" w:id="2120663480">
+        <w:r>
+          <w:t>won’t</w:t>
+        </w:r>
+      </w:ins>
+      <w:ins w:author="A00020186 Ocean Wojcicki" w:date="2026-04-29T17:51:58.958Z" w16du:dateUtc="2026-04-29T17:51:58.958Z" w:id="126671170">
+        <w:r>
+          <w:t xml:space="preserve"> be collecting any personal </w:t>
+        </w:r>
+        <w:r>
+          <w:t>inforamtion</w:t>
+        </w:r>
+        <w:r>
+          <w:t xml:space="preserve"> that includes a student’s home address, their credit card information, or anything </w:t>
+        </w:r>
+        <w:r>
+          <w:t>thats</w:t>
+        </w:r>
+        <w:r>
+          <w:t xml:space="preserve"> too sensitive. What the web app will be collecting is only </w:t>
+        </w:r>
+      </w:ins>
+      <w:ins w:author="A00020186 Ocean Wojcicki" w:date="2026-04-29T17:52:52.717Z" w16du:dateUtc="2026-04-29T17:52:52.717Z" w:id="244245972">
+        <w:r>
+          <w:t xml:space="preserve">bare </w:t>
+        </w:r>
+      </w:ins>
+      <w:ins w:author="A00020186 Ocean Wojcicki" w:date="2026-04-29T17:54:58.443Z" w16du:dateUtc="2026-04-29T17:54:58.443Z" w:id="2091631722">
+        <w:r>
+          <w:t>minimum,</w:t>
+        </w:r>
+      </w:ins>
+      <w:ins w:author="A00020186 Ocean Wojcicki" w:date="2026-04-29T17:52:52.717Z" w16du:dateUtc="2026-04-29T17:52:52.717Z" w:id="414910328">
+        <w:r>
+          <w:t xml:space="preserve"> li</w:t>
+        </w:r>
+        <w:r>
+          <w:t xml:space="preserve">ke asking the user for their student email wherever needed. This will be applied to all pages that </w:t>
+        </w:r>
+      </w:ins>
+      <w:ins w:author="A00020186 Ocean Wojcicki" w:date="2026-04-29T18:46:53.381Z" w16du:dateUtc="2026-04-29T18:46:53.381Z" w:id="1607271640">
+        <w:r>
+          <w:t>require</w:t>
+        </w:r>
+        <w:r>
+          <w:t xml:space="preserve"> </w:t>
+        </w:r>
+      </w:ins>
+      <w:ins w:author="A00020186 Ocean Wojcicki" w:date="2026-04-29T17:52:52.717Z" w16du:dateUtc="2026-04-29T17:52:52.717Z" w:id="667040300">
+        <w:r>
+          <w:t xml:space="preserve">a way </w:t>
+        </w:r>
+      </w:ins>
+      <w:ins w:author="A00020186 Ocean Wojcicki" w:date="2026-04-29T18:46:55.733Z" w16du:dateUtc="2026-04-29T18:46:55.733Z" w:id="1107182148">
+        <w:r>
+          <w:t>to give</w:t>
+        </w:r>
+      </w:ins>
+      <w:ins w:author="A00020186 Ocean Wojcicki" w:date="2026-04-29T17:52:52.717Z" w16du:dateUtc="2026-04-29T17:52:52.717Z" w:id="1899839936">
+        <w:r>
+          <w:t xml:space="preserve"> feedback to the user after they </w:t>
+        </w:r>
+        <w:r>
+          <w:t>submit</w:t>
+        </w:r>
+        <w:r>
+          <w:t xml:space="preserve"> something.</w:t>
+        </w:r>
+      </w:ins>
+      <w:del w:author="A00020186 Ocean Wojcicki" w:date="2026-04-29T18:47:03.129Z" w16du:dateUtc="2026-04-29T18:47:03.129Z" w:id="1003935920">
+        <w:r>
+          <w:delText>T</w:delText>
+        </w:r>
+      </w:del>
+    </w:p>
+    <w:p>
+      <w:pPr>
+        <w:pStyle w:val="Normal"/>
+        <w:jc w:val="both"/>
+        <w:rPr>
+          <w:ins w:author="A00020186 Ocean Wojcicki" w:date="2026-04-29T19:54:12.513Z" w16du:dateUtc="2026-04-29T19:54:12.513Z" w:id="177182644"/>
+        </w:rPr>
+      </w:pPr>
+      <w:ins w:author="A00020186 Ocean Wojcicki" w:date="2026-04-29T18:47:58.413Z" w16du:dateUtc="2026-04-29T18:47:58.413Z" w:id="584577658">
+        <w:r>
+          <w:t xml:space="preserve">For example, when </w:t>
+        </w:r>
+        <w:r>
+          <w:t>submitting</w:t>
+        </w:r>
+        <w:r>
+          <w:t xml:space="preserve"> a ticket on the helpdesk page, it will only ask for a student email and a description of the issue they</w:t>
+        </w:r>
+      </w:ins>
+      <w:ins w:author="A00020186 Ocean Wojcicki" w:date="2026-04-29T18:48:05.737Z" w16du:dateUtc="2026-04-29T18:48:05.737Z" w:id="1099183265">
+        <w:r>
+          <w:t xml:space="preserve"> have.</w:t>
+        </w:r>
+      </w:ins>
+    </w:p>
+    <w:tbl>
+      <w:tblPr>
+        <w:tblStyle w:val="TableGrid"/>
+        <w:tblW w:w="0" w:type="auto"/>
+        <w:tblLook w:val="06A0" w:firstRow="1" w:lastRow="0" w:firstColumn="1" w:lastColumn="0" w:noHBand="1" w:noVBand="1"/>
+      </w:tblPr>
+      <w:tblGrid>
+        <w:gridCol w:w="3120"/>
+        <w:gridCol w:w="3120"/>
+        <w:gridCol w:w="3120"/>
+      </w:tblGrid>
+      <w:tr>
+        <w:trPr>
+          <w:trHeight w:val="300"/>
+          <w:ins w:author="A00020186 Ocean Wojcicki" w:date="2026-04-29T20:07:07.061Z" w16du:dateUtc="2026-04-29T20:07:07.061Z" w:id="551604892"/>
+        </w:trPr>
+        <w:tc>
+          <w:tcPr>
+            <w:tcW w:w="3120" w:type="dxa"/>
+            <w:tcMar/>
+          </w:tcPr>
+          <w:p>
+            <w:pPr>
+              <w:pStyle w:val="Normal"/>
+            </w:pPr>
+            <w:ins w:author="A00020186 Ocean Wojcicki" w:date="2026-04-29T20:07:11.857Z" w16du:dateUtc="2026-04-29T20:07:11.857Z" w:id="1648329482">
+              <w:r>
+                <w:t>Entity</w:t>
+              </w:r>
+            </w:ins>
+          </w:p>
+        </w:tc>
+        <w:tc>
+          <w:tcPr>
+            <w:tcW w:w="3120" w:type="dxa"/>
+            <w:tcMar/>
+          </w:tcPr>
+          <w:p>
+            <w:pPr>
+              <w:pStyle w:val="Normal"/>
+            </w:pPr>
+            <w:ins w:author="A00020186 Ocean Wojcicki" w:date="2026-04-29T20:07:17.695Z" w16du:dateUtc="2026-04-29T20:07:17.695Z" w:id="1218414990">
+              <w:r>
+                <w:t>Attribute</w:t>
+              </w:r>
+            </w:ins>
+            <w:ins w:author="A00020186 Ocean Wojcicki" w:date="2026-04-29T20:08:03.798Z" w16du:dateUtc="2026-04-29T20:08:03.798Z" w:id="1825012555">
+              <w:r>
+                <w:t>s</w:t>
+              </w:r>
+            </w:ins>
+          </w:p>
+        </w:tc>
+        <w:tc>
+          <w:tcPr>
+            <w:tcW w:w="3120" w:type="dxa"/>
+            <w:tcMar/>
+          </w:tcPr>
+          <w:p>
+            <w:pPr>
+              <w:pStyle w:val="Normal"/>
+            </w:pPr>
+            <w:ins w:author="A00020186 Ocean Wojcicki" w:date="2026-04-29T20:07:26.252Z" w16du:dateUtc="2026-04-29T20:07:26.252Z" w:id="231447587">
+              <w:r>
+                <w:t>Relationship</w:t>
+              </w:r>
+            </w:ins>
+            <w:ins w:author="A00020186 Ocean Wojcicki" w:date="2026-04-29T20:46:19.75Z" w16du:dateUtc="2026-04-29T20:46:19.75Z" w:id="527826010">
+              <w:r>
+                <w:t>s</w:t>
+              </w:r>
+            </w:ins>
+          </w:p>
+        </w:tc>
+      </w:tr>
+      <w:tr>
+        <w:trPr>
+          <w:trHeight w:val="300"/>
+          <w:ins w:author="A00020186 Ocean Wojcicki" w:date="2026-04-29T20:07:07.061Z" w16du:dateUtc="2026-04-29T20:07:07.061Z" w:id="31540133"/>
+        </w:trPr>
+        <w:tc>
+          <w:tcPr>
+            <w:tcW w:w="3120" w:type="dxa"/>
+            <w:tcMar/>
+          </w:tcPr>
+          <w:p>
+            <w:pPr>
+              <w:pStyle w:val="Normal"/>
+            </w:pPr>
+            <w:ins w:author="A00020186 Ocean Wojcicki" w:date="2026-04-29T20:07:59.789Z" w16du:dateUtc="2026-04-29T20:07:59.789Z" w:id="1550916465">
+              <w:r>
+                <w:t>Timetable</w:t>
+              </w:r>
+            </w:ins>
+          </w:p>
+        </w:tc>
+        <w:tc>
+          <w:tcPr>
+            <w:tcW w:w="3120" w:type="dxa"/>
+            <w:tcMar/>
+          </w:tcPr>
+          <w:p>
+            <w:pPr>
+              <w:pStyle w:val="Normal"/>
+            </w:pPr>
+            <w:ins w:author="A00020186 Ocean Wojcicki" w:date="2026-04-29T20:12:49.25Z" w16du:dateUtc="2026-04-29T20:12:49.25Z" w:id="41473284">
+              <w:r>
+                <w:t>Course</w:t>
+              </w:r>
+            </w:ins>
+            <w:ins w:author="A00020186 Ocean Wojcicki" w:date="2026-04-29T20:46:40.072Z" w16du:dateUtc="2026-04-29T20:46:40.072Z" w:id="1003491934">
+              <w:r>
+                <w:t xml:space="preserve">, Course Group, </w:t>
+              </w:r>
+            </w:ins>
+            <w:ins w:author="A00020186 Ocean Wojcicki" w:date="2026-04-29T20:47:41.703Z" w16du:dateUtc="2026-04-29T20:47:41.703Z" w:id="808340282">
+              <w:r>
+                <w:t xml:space="preserve">Days of the </w:t>
+              </w:r>
+            </w:ins>
+            <w:ins w:author="A00020186 Ocean Wojcicki" w:date="2026-04-29T21:12:20.873Z" w16du:dateUtc="2026-04-29T21:12:20.873Z" w:id="1511851932">
+              <w:r>
+                <w:t>Week.</w:t>
+              </w:r>
+            </w:ins>
+          </w:p>
+        </w:tc>
+        <w:tc>
+          <w:tcPr>
+            <w:tcW w:w="3120" w:type="dxa"/>
+            <w:tcMar/>
+          </w:tcPr>
+          <w:p>
+            <w:pPr>
+              <w:pStyle w:val="Normal"/>
+            </w:pPr>
+            <w:ins w:author="A00020186 Ocean Wojcicki" w:date="2026-04-29T23:05:13.288Z" w16du:dateUtc="2026-04-29T23:05:13.288Z" w:id="614120970">
+              <w:r>
+                <w:t xml:space="preserve">One to many </w:t>
+              </w:r>
+              <w:r>
+                <w:t>relationship</w:t>
+              </w:r>
+              <w:r>
+                <w:t xml:space="preserve"> between </w:t>
+              </w:r>
+            </w:ins>
+            <w:ins w:author="A00020186 Ocean Wojcicki" w:date="2026-04-29T23:06:09.594Z" w16du:dateUtc="2026-04-29T23:06:09.594Z" w:id="1365702582">
+              <w:r>
+                <w:t>the course and groups.</w:t>
+              </w:r>
+            </w:ins>
+          </w:p>
+        </w:tc>
+      </w:tr>
+      <w:tr>
+        <w:trPr>
+          <w:trHeight w:val="300"/>
+          <w:ins w:author="A00020186 Ocean Wojcicki" w:date="2026-04-29T20:07:07.061Z" w16du:dateUtc="2026-04-29T20:07:07.061Z" w:id="58353112"/>
+        </w:trPr>
+        <w:tc>
+          <w:tcPr>
+            <w:tcW w:w="3120" w:type="dxa"/>
+            <w:tcMar/>
+          </w:tcPr>
+          <w:p>
+            <w:pPr>
+              <w:pStyle w:val="Normal"/>
+            </w:pPr>
+            <w:ins w:author="A00020186 Ocean Wojcicki" w:date="2026-04-30T00:57:24.525Z" w16du:dateUtc="2026-04-30T00:57:24.525Z" w:id="537211613">
+              <w:r>
+                <w:t>Events</w:t>
+              </w:r>
+            </w:ins>
+          </w:p>
+        </w:tc>
+        <w:tc>
+          <w:tcPr>
+            <w:tcW w:w="3120" w:type="dxa"/>
+            <w:tcMar/>
+          </w:tcPr>
+          <w:p>
+            <w:pPr>
+              <w:pStyle w:val="Normal"/>
+            </w:pPr>
+            <w:ins w:author="A00020186 Ocean Wojcicki" w:date="2026-04-30T00:58:21.543Z" w16du:dateUtc="2026-04-30T00:58:21.543Z" w:id="44451146">
+              <w:r>
+                <w:t>Date, time, location</w:t>
+              </w:r>
+            </w:ins>
+          </w:p>
+        </w:tc>
+        <w:tc>
+          <w:tcPr>
+            <w:tcW w:w="3120" w:type="dxa"/>
+            <w:tcMar/>
+          </w:tcPr>
+          <w:p>
+            <w:pPr>
+              <w:pStyle w:val="Normal"/>
+            </w:pPr>
+            <w:ins w:author="A00020186 Ocean Wojcicki" w:date="2026-04-30T01:08:44.647Z" w16du:dateUtc="2026-04-30T01:08:44.647Z" w:id="1015135803">
+              <w:r>
+                <w:t>One</w:t>
+              </w:r>
+            </w:ins>
+            <w:ins w:author="A00020186 Ocean Wojcicki" w:date="2026-04-30T00:59:50.527Z" w16du:dateUtc="2026-04-30T00:59:50.527Z" w:id="1176573678">
+              <w:r>
+                <w:t xml:space="preserve"> </w:t>
+              </w:r>
+            </w:ins>
+            <w:ins w:author="A00020186 Ocean Wojcicki" w:date="2026-04-30T01:08:44.768Z" w16du:dateUtc="2026-04-30T01:08:44.768Z" w:id="614661433">
+              <w:r>
+                <w:t xml:space="preserve"> </w:t>
+              </w:r>
+            </w:ins>
+            <w:ins w:author="A00020186 Ocean Wojcicki" w:date="2026-04-30T00:59:50.527Z" w16du:dateUtc="2026-04-30T00:59:50.527Z" w:id="1160409935">
+              <w:r>
+                <w:t>event can have multiple registrations tied to it</w:t>
+              </w:r>
+            </w:ins>
+          </w:p>
+        </w:tc>
+      </w:tr>
+      <w:tr>
+        <w:trPr>
+          <w:trHeight w:val="300"/>
+          <w:ins w:author="A00020186 Ocean Wojcicki" w:date="2026-04-30T01:12:52.577Z" w16du:dateUtc="2026-04-30T01:12:52.577Z" w:id="104092933"/>
+        </w:trPr>
+        <w:tc>
+          <w:tcPr>
+            <w:tcW w:w="3120" w:type="dxa"/>
+            <w:tcMar/>
+          </w:tcPr>
+          <w:p>
+            <w:pPr>
+              <w:pStyle w:val="Normal"/>
+            </w:pPr>
+            <w:ins w:author="A00020186 Ocean Wojcicki" w:date="2026-04-30T01:12:57.845Z" w16du:dateUtc="2026-04-30T01:12:57.845Z" w:id="1297385318">
+              <w:r>
+                <w:t>Menu</w:t>
+              </w:r>
+            </w:ins>
+          </w:p>
+        </w:tc>
+        <w:tc>
+          <w:tcPr>
+            <w:tcW w:w="3120" w:type="dxa"/>
+            <w:tcMar/>
+          </w:tcPr>
+          <w:p>
+            <w:pPr>
+              <w:pStyle w:val="Normal"/>
+            </w:pPr>
+            <w:ins w:author="A00020186 Ocean Wojcicki" w:date="2026-04-30T01:21:23.394Z" w16du:dateUtc="2026-04-30T01:21:23.394Z" w:id="2079660842">
+              <w:r>
+                <w:t>Category, Item name, price, allergens</w:t>
+              </w:r>
+            </w:ins>
+          </w:p>
+        </w:tc>
+        <w:tc>
+          <w:tcPr>
+            <w:tcW w:w="3120" w:type="dxa"/>
+            <w:tcMar/>
+          </w:tcPr>
+          <w:p>
+            <w:pPr>
+              <w:pStyle w:val="Normal"/>
+            </w:pPr>
+            <w:ins w:author="A00020186 Ocean Wojcicki" w:date="2026-04-30T01:22:57.487Z" w16du:dateUtc="2026-04-30T01:22:57.487Z" w:id="1037037629">
+              <w:r>
+                <w:t xml:space="preserve">Another </w:t>
+              </w:r>
+              <w:r>
+                <w:t>one to many</w:t>
+              </w:r>
+              <w:r>
+                <w:t xml:space="preserve"> link between the menu category and the food items. </w:t>
+              </w:r>
+            </w:ins>
+          </w:p>
+        </w:tc>
+      </w:tr>
+    </w:tbl>
+    <w:p>
+      <w:pPr>
+        <w:rPr>
+          <w:del w:author="A00020186 Ocean Wojcicki" w:date="2026-04-30T01:00:18.298Z" w16du:dateUtc="2026-04-30T01:00:18.298Z" w:id="802948383"/>
+        </w:rPr>
+      </w:pPr>
+    </w:p>
+    <w:p>
+      <w:pPr>
+        <w:rPr>
+          <w:ins w:author="A00020186 Ocean Wojcicki" w:date="2026-04-30T01:08:55.099Z" w16du:dateUtc="2026-04-30T01:08:55.099Z" w:id="1724829747"/>
+        </w:rPr>
+      </w:pPr>
+      <w:ins w:author="A00020186 Ocean Wojcicki" w:date="2026-04-30T01:05:59.988Z" w16du:dateUtc="2026-04-30T01:05:59.988Z" w:id="462792612">
+        <w:r>
+          <w:t>So</w:t>
+        </w:r>
+        <w:r>
+          <w:t xml:space="preserve"> </w:t>
+        </w:r>
+      </w:ins>
+      <w:ins w:author="A00020186 Ocean Wojcicki" w:date="2026-04-30T01:06:58.802Z" w16du:dateUtc="2026-04-30T01:06:58.802Z" w:id="264435982">
+        <w:r>
+          <w:t xml:space="preserve">the timetable will show options to choose a course, the </w:t>
+        </w:r>
+      </w:ins>
+      <w:ins w:author="A00020186 Ocean Wojcicki" w:date="2026-04-30T01:09:08.127Z" w16du:dateUtc="2026-04-30T01:09:08.127Z" w:id="1306541083">
+        <w:r>
+          <w:t>group,</w:t>
+        </w:r>
+      </w:ins>
+      <w:ins w:author="A00020186 Ocean Wojcicki" w:date="2026-04-30T01:06:58.802Z" w16du:dateUtc="2026-04-30T01:06:58.802Z" w:id="1757843041">
+        <w:r>
+          <w:t xml:space="preserve"> and a day of the week</w:t>
+        </w:r>
+      </w:ins>
+      <w:ins w:author="A00020186 Ocean Wojcicki" w:date="2026-04-30T01:07:46.039Z" w16du:dateUtc="2026-04-30T01:07:46.039Z" w:id="254258362">
+        <w:r>
+          <w:t xml:space="preserve"> for students to see their timetable. There is a “one to many”</w:t>
+        </w:r>
+      </w:ins>
+      <w:ins w:author="A00020186 Ocean Wojcicki" w:date="2026-04-30T01:07:46.125Z" w16du:dateUtc="2026-04-30T01:07:46.125Z" w:id="1777750009">
+        <w:r>
+          <w:t xml:space="preserve"> relationship between the course and the groups</w:t>
+        </w:r>
+      </w:ins>
+      <w:ins w:author="A00020186 Ocean Wojcicki" w:date="2026-04-30T01:08:21.496Z" w16du:dateUtc="2026-04-30T01:08:21.496Z" w:id="1569830203">
+        <w:r>
+          <w:t xml:space="preserve"> as there </w:t>
+        </w:r>
+      </w:ins>
+      <w:ins w:author="A00020186 Ocean Wojcicki" w:date="2026-04-30T01:09:26.647Z" w16du:dateUtc="2026-04-30T01:09:26.647Z" w:id="1926351027">
+        <w:r>
+          <w:t>are multiple</w:t>
+        </w:r>
+      </w:ins>
+      <w:ins w:author="A00020186 Ocean Wojcicki" w:date="2026-04-30T01:08:21.496Z" w16du:dateUtc="2026-04-30T01:08:21.496Z" w:id="1175782545">
+        <w:r>
+          <w:t xml:space="preserve"> groups for each course. </w:t>
+        </w:r>
+      </w:ins>
+    </w:p>
+    <w:p>
+      <w:pPr>
+        <w:rPr>
+          <w:ins w:author="A00020186 Ocean Wojcicki" w:date="2026-04-30T01:23:05.97Z" w16du:dateUtc="2026-04-30T01:23:05.97Z" w:id="1735430214"/>
+        </w:rPr>
+      </w:pPr>
+      <w:ins w:author="A00020186 Ocean Wojcicki" w:date="2026-04-30T01:09:53.181Z" w16du:dateUtc="2026-04-30T01:09:53.181Z" w:id="431729278">
+        <w:r>
+          <w:t xml:space="preserve">Another entity will be the </w:t>
+        </w:r>
+        <w:r>
+          <w:t>events,</w:t>
+        </w:r>
+        <w:r>
+          <w:t xml:space="preserve"> </w:t>
+        </w:r>
+      </w:ins>
+      <w:ins w:author="A00020186 Ocean Wojcicki" w:date="2026-04-30T01:10:58.826Z" w16du:dateUtc="2026-04-30T01:10:58.826Z" w:id="377002150">
+        <w:r>
+          <w:t xml:space="preserve">this also has a </w:t>
+        </w:r>
+        <w:r>
+          <w:t>one to many</w:t>
+        </w:r>
+        <w:r>
+          <w:t xml:space="preserve"> relationship as one event wi</w:t>
+        </w:r>
+        <w:r>
+          <w:t>ll have many students registering for it.</w:t>
+        </w:r>
+      </w:ins>
+    </w:p>
+    <w:p>
+      <w:pPr>
+        <w:rPr>
+          <w:del w:author="A00020186 Ocean Wojcicki" w:date="2026-04-30T01:07:48.388Z" w16du:dateUtc="2026-04-30T01:07:48.388Z" w:id="269819055"/>
+        </w:rPr>
+      </w:pPr>
+      <w:ins w:author="A00020186 Ocean Wojcicki" w:date="2026-04-30T01:23:59.287Z" w16du:dateUtc="2026-04-30T01:23:59.287Z" w:id="88267408">
+        <w:r>
+          <w:t xml:space="preserve">The menu has 2 </w:t>
+        </w:r>
+        <w:r>
+          <w:t>categories, so</w:t>
+        </w:r>
+        <w:r>
+          <w:t xml:space="preserve"> a special menu and an everyday menu.</w:t>
+        </w:r>
+      </w:ins>
+      <w:ins w:author="A00020186 Ocean Wojcicki" w:date="2026-04-30T01:24:20.399Z" w16du:dateUtc="2026-04-30T01:24:20.399Z" w:id="1483858527">
+        <w:r>
+          <w:t xml:space="preserve"> Each</w:t>
+        </w:r>
+      </w:ins>
+      <w:ins w:author="A00020186 Ocean Wojcicki" w:date="2026-04-30T01:23:59.287Z" w16du:dateUtc="2026-04-30T01:23:59.287Z" w:id="1588203675">
+        <w:r>
+          <w:t xml:space="preserve"> </w:t>
+        </w:r>
+      </w:ins>
+      <w:ins w:author="A00020186 Ocean Wojcicki" w:date="2026-04-30T01:24:25.89Z" w16du:dateUtc="2026-04-30T01:24:25.89Z" w:id="47041281">
+        <w:r>
+          <w:t>category</w:t>
+        </w:r>
+      </w:ins>
+      <w:ins w:author="A00020186 Ocean Wojcicki" w:date="2026-04-30T01:23:59.287Z" w16du:dateUtc="2026-04-30T01:23:59.287Z" w:id="1104264703">
+        <w:r>
+          <w:t xml:space="preserve"> </w:t>
+        </w:r>
+      </w:ins>
+      <w:ins w:author="A00020186 Ocean Wojcicki" w:date="2026-04-30T01:24:13.425Z" w16du:dateUtc="2026-04-30T01:24:13.425Z" w:id="1190015130">
+        <w:r>
+          <w:t>ha</w:t>
+        </w:r>
+        <w:r>
+          <w:t>s</w:t>
+        </w:r>
+      </w:ins>
+      <w:ins w:author="A00020186 Ocean Wojcicki" w:date="2026-04-30T01:24:43.813Z" w16du:dateUtc="2026-04-30T01:24:43.813Z" w:id="735628440">
+        <w:r>
+          <w:t xml:space="preserve"> multiple food opt</w:t>
+        </w:r>
+        <w:r>
+          <w:t>ions</w:t>
+        </w:r>
+        <w:r>
+          <w:t xml:space="preserve"> to choose from. </w:t>
+        </w:r>
+      </w:ins>
+    </w:p>
+    <w:p>
+      <w:pPr>
+        <w:pStyle w:val="Normal"/>
+        <w:jc w:val="both"/>
+        <w:rPr>
+          <w:del w:author="A00020186 Ocean Wojcicki" w:date="2026-04-29T17:44:11.808Z" w16du:dateUtc="2026-04-29T17:44:11.808Z" w:id="302157140"/>
+        </w:rPr>
+      </w:pPr>
+      <w:del w:author="A00020186 Ocean Wojcicki" w:date="2026-04-29T17:44:11.808Z" w16du:dateUtc="2026-04-29T17:44:11.808Z" w:id="2016612003">
+        <w:r>
+          <w:delText xml:space="preserve">he key entities we chose to </w:delText>
+        </w:r>
+        <w:r>
+          <w:delText>put in</w:delText>
+        </w:r>
+        <w:r>
+          <w:delText>to</w:delText>
+        </w:r>
+        <w:r>
+          <w:delText xml:space="preserve"> the application were</w:delText>
+        </w:r>
+        <w:r>
+          <w:delText xml:space="preserve"> </w:delText>
+        </w:r>
+        <w:r>
+          <w:delText xml:space="preserve">a canteen menu, </w:delText>
+        </w:r>
+        <w:r>
+          <w:delText xml:space="preserve">a helpdesk and lost &amp; found page, a map and timetable. </w:delText>
+        </w:r>
+      </w:del>
+    </w:p>
+    <w:p>
+      <w:pPr>
+        <w:jc w:val="both"/>
+        <w:rPr>
+          <w:del w:author="A00020186 Ocean Wojcicki" w:date="2026-04-29T17:44:11.808Z" w16du:dateUtc="2026-04-29T17:44:11.808Z" w:id="748214911"/>
+        </w:rPr>
+      </w:pPr>
+      <w:del w:author="A00020186 Ocean Wojcicki" w:date="2026-04-29T19:06:03.826Z" w16du:dateUtc="2026-04-29T19:06:03.826Z" w:id="411976790">
+        <w:r>
+          <w:delText>F</w:delText>
+        </w:r>
+      </w:del>
+      <w:del w:author="A00020186 Ocean Wojcicki" w:date="2026-04-29T17:44:11.808Z" w16du:dateUtc="2026-04-29T17:44:11.808Z" w:id="96370090">
+        <w:r>
+          <w:delText xml:space="preserve">or data minimization, </w:delText>
+        </w:r>
+        <w:r>
+          <w:delText xml:space="preserve">we </w:delText>
+        </w:r>
+        <w:r>
+          <w:delText>won't</w:delText>
+        </w:r>
+        <w:r>
+          <w:delText xml:space="preserve"> </w:delText>
+        </w:r>
+        <w:r>
+          <w:delText>be collecting</w:delText>
+        </w:r>
+        <w:r>
+          <w:delText xml:space="preserve"> any personal information that includes a personal email, phone number</w:delText>
+        </w:r>
+        <w:r>
+          <w:delText>,</w:delText>
+        </w:r>
+        <w:r>
+          <w:delText xml:space="preserve"> or address. </w:delText>
+        </w:r>
+        <w:r>
+          <w:delText xml:space="preserve">What the application will be collecting is only the bare minimum, so our </w:delText>
+        </w:r>
+        <w:r>
+          <w:delText>pages</w:delText>
+        </w:r>
+        <w:r>
+          <w:delText xml:space="preserve"> can be </w:delText>
+        </w:r>
+        <w:r>
+          <w:delText>somewhat interactable</w:delText>
+        </w:r>
+        <w:r>
+          <w:delText xml:space="preserve">. </w:delText>
+        </w:r>
+      </w:del>
+    </w:p>
+    <w:p>
+      <w:pPr>
+        <w:jc w:val="both"/>
+        <w:rPr>
+          <w:del w:author="A00020186 Ocean Wojcicki" w:date="2026-04-29T17:44:11.807Z" w16du:dateUtc="2026-04-29T17:44:11.807Z" w:id="324167974"/>
+        </w:rPr>
+      </w:pPr>
+      <w:del w:author="A00020186 Ocean Wojcicki" w:date="2026-04-29T17:44:11.807Z" w16du:dateUtc="2026-04-29T17:44:11.807Z" w:id="135044730">
+        <w:r>
+          <w:delText xml:space="preserve">For example, when we create the helpdesk page, </w:delText>
+        </w:r>
+        <w:r>
+          <w:delText>it</w:delText>
+        </w:r>
+        <w:r>
+          <w:delText xml:space="preserve"> </w:delText>
+        </w:r>
+        <w:r>
+          <w:delText>won’t</w:delText>
+        </w:r>
+        <w:r>
+          <w:delText xml:space="preserve"> be asking for any student</w:delText>
+        </w:r>
+        <w:r>
+          <w:delText xml:space="preserve"> </w:delText>
+        </w:r>
+        <w:r>
+          <w:delText>information</w:delText>
+        </w:r>
+        <w:r>
+          <w:delText>;</w:delText>
+        </w:r>
+        <w:r>
+          <w:delText xml:space="preserve"> </w:delText>
+        </w:r>
+        <w:r>
+          <w:delText>there will</w:delText>
+        </w:r>
+        <w:r>
+          <w:delText xml:space="preserve"> just be a </w:delText>
+        </w:r>
+        <w:r>
+          <w:delText xml:space="preserve">drop-down menu </w:delText>
+        </w:r>
+        <w:r>
+          <w:delText>option to choose the issue and a</w:delText>
+        </w:r>
+        <w:r>
+          <w:delText>n area</w:delText>
+        </w:r>
+        <w:r>
+          <w:delText xml:space="preserve"> to type a short description. </w:delText>
+        </w:r>
+      </w:del>
+    </w:p>
+    <w:p>
+      <w:pPr>
+        <w:jc w:val="both"/>
+        <w:rPr>
+          <w:del w:author="A00020186 Ocean Wojcicki" w:date="2026-04-29T17:44:11.806Z" w16du:dateUtc="2026-04-29T17:44:11.806Z" w:id="1489348577"/>
+        </w:rPr>
+      </w:pPr>
+      <w:del w:author="A00020186 Ocean Wojcicki" w:date="2026-04-29T17:44:11.807Z" w16du:dateUtc="2026-04-29T17:44:11.807Z" w:id="299274469">
+        <w:r>
+          <w:delText xml:space="preserve">For the timetable, we will make it so there will be an option to choose what group </w:delText>
+        </w:r>
+        <w:r>
+          <w:delText>you're</w:delText>
+        </w:r>
+        <w:r>
+          <w:delText xml:space="preserve"> in</w:delText>
+        </w:r>
+        <w:r>
+          <w:delText>,</w:delText>
+        </w:r>
+        <w:r>
+          <w:delText xml:space="preserve"> and a specified made</w:delText>
+        </w:r>
+        <w:r>
+          <w:delText>-</w:delText>
+        </w:r>
+        <w:r>
+          <w:delText xml:space="preserve">up </w:delText>
+        </w:r>
+        <w:r>
+          <w:delText>timetable</w:delText>
+        </w:r>
+        <w:r>
+          <w:delText xml:space="preserve"> for that </w:delText>
+        </w:r>
+        <w:r>
+          <w:delText xml:space="preserve">group will appear. </w:delText>
+        </w:r>
+        <w:r>
+          <w:delText>No</w:delText>
+        </w:r>
+        <w:r>
+          <w:delText xml:space="preserve"> personal student info will be needed. </w:delText>
+        </w:r>
+      </w:del>
+    </w:p>
+    <w:p>
+      <w:pPr>
+        <w:jc w:val="both"/>
+        <w:rPr>
+          <w:del w:author="A00020186 Ocean Wojcicki" w:date="2026-04-29T17:44:11.806Z" w16du:dateUtc="2026-04-29T17:44:11.806Z" w:id="1128780855"/>
+        </w:rPr>
+      </w:pPr>
+      <w:del w:author="A00020186 Ocean Wojcicki" w:date="2026-04-29T17:44:11.806Z" w16du:dateUtc="2026-04-29T17:44:11.806Z" w:id="2129136038">
+        <w:r>
+          <w:delText xml:space="preserve">For the map, it will only display the area of the fake college with markers randomly placed labelling a building name. </w:delText>
+        </w:r>
+        <w:r>
+          <w:delText>The application won't be asking for a student's location.</w:delText>
+        </w:r>
+      </w:del>
+    </w:p>
+    <w:p>
+      <w:pPr>
+        <w:jc w:val="both"/>
+        <w:rPr>
+          <w:rFonts w:ascii="Aptos" w:hAnsi="Aptos" w:eastAsia="Aptos" w:cs="Aptos"/>
+          <w:b w:val="0"/>
+          <w:bCs w:val="0"/>
+          <w:i w:val="0"/>
+          <w:iCs w:val="0"/>
+          <w:noProof w:val="0"/>
+          <w:color w:val="D13438"/>
+          <w:sz w:val="24"/>
+          <w:szCs w:val="24"/>
+          <w:lang w:val="en-US"/>
+        </w:rPr>
+      </w:pPr>
+      <w:del w:author="A00020186 Ocean Wojcicki" w:date="2026-04-29T17:44:11.806Z" w16du:dateUtc="2026-04-29T17:44:11.806Z" w:id="917759027">
+        <w:r>
+          <w:delText xml:space="preserve">For the lost and found page, we will only </w:delText>
+        </w:r>
+        <w:r>
+          <w:delText>add</w:delText>
+        </w:r>
+        <w:r>
+          <w:delText xml:space="preserve"> an option to </w:delText>
+        </w:r>
+        <w:r>
+          <w:delText>describe</w:delText>
+        </w:r>
+        <w:r>
+          <w:delText xml:space="preserve"> the item </w:delText>
+        </w:r>
+        <w:r>
+          <w:delText xml:space="preserve">or </w:delText>
+        </w:r>
+        <w:r>
+          <w:delText>display a list of made-up</w:delText>
+        </w:r>
+        <w:r>
+          <w:delText xml:space="preserve"> items and add a “claim” button. </w:delText>
+        </w:r>
+      </w:del>
     </w:p>
     <w:p>
       <w:pPr>
@@ -598,7 +1232,22 @@
         <w:jc w:val="both"/>
       </w:pPr>
       <w:r>
-        <w:t>The design choices we will implement will be simple for users to easily navigate the application. This will include a navigation bar, buttons on the home page labelled to its destination, clear accessibility like quick links, animations, and user support, etc.</w:t>
+        <w:rPr/>
+        <w:t>The design choices we will implement will be simple for users to easily navigate the application. This will include a navigation bar, buttons on the home page labelled to its destination, clear accessibility like quick links</w:t>
+      </w:r>
+      <w:ins w:author="A00020186 Ocean Wojcicki" w:date="2026-04-30T01:01:59.958Z" w16du:dateUtc="2026-04-30T01:01:59.958Z" w:id="1004918071">
+        <w:r>
+          <w:t xml:space="preserve"> across the </w:t>
+        </w:r>
+      </w:ins>
+      <w:ins w:author="A00020186 Ocean Wojcicki" w:date="2026-04-30T01:02:07.767Z" w16du:dateUtc="2026-04-30T01:02:07.767Z" w:id="1486276760">
+        <w:r>
+          <w:t>app and inside the footers</w:t>
+        </w:r>
+      </w:ins>
+      <w:r>
+        <w:rPr/>
+        <w:t>, animations, and user support, etc.</w:t>
       </w:r>
     </w:p>
     <w:p>
@@ -618,30 +1267,80 @@
         <w:jc w:val="both"/>
       </w:pPr>
       <w:r>
-        <w:lastRenderedPageBreak/>
+        <w:rPr/>
         <w:t xml:space="preserve">The layout will be consistent </w:t>
       </w:r>
       <w:r>
+        <w:rPr/>
         <w:t xml:space="preserve">throughout the entire application displaying </w:t>
       </w:r>
       <w:r>
-        <w:t xml:space="preserve">a consistent white, blue and grey colour </w:t>
-      </w:r>
-      <w:r>
+        <w:rPr/>
+        <w:t xml:space="preserve">a consistent white, blue and grey </w:t>
+      </w:r>
+      <w:r>
+        <w:rPr/>
+        <w:t>colour</w:t>
+      </w:r>
+      <w:r>
+        <w:rPr/>
+        <w:t xml:space="preserve"> </w:t>
+      </w:r>
+      <w:r>
+        <w:rPr/>
         <w:t>scheme;</w:t>
       </w:r>
       <w:r>
+        <w:rPr/>
         <w:t xml:space="preserve"> the font and sizes of text </w:t>
       </w:r>
       <w:r>
+        <w:rPr/>
         <w:t xml:space="preserve">will </w:t>
       </w:r>
       <w:r>
-        <w:t xml:space="preserve">stay the same on every page, </w:t>
-      </w:r>
-      <w:r>
-        <w:t xml:space="preserve">and it is compatible for those on a phone. </w:t>
-      </w:r>
+        <w:rPr/>
+        <w:t xml:space="preserve">stay the same on every </w:t>
+      </w:r>
+      <w:del w:author="A00020186 Ocean Wojcicki" w:date="2026-04-30T01:02:45.931Z" w16du:dateUtc="2026-04-30T01:02:45.931Z" w:id="2097256504">
+        <w:r>
+          <w:delText xml:space="preserve">page, </w:delText>
+        </w:r>
+        <w:r>
+          <w:delText>and</w:delText>
+        </w:r>
+      </w:del>
+      <w:ins w:author="A00020186 Ocean Wojcicki" w:date="2026-04-30T01:02:45.932Z" w16du:dateUtc="2026-04-30T01:02:45.932Z" w:id="1320583593">
+        <w:r>
+          <w:t>page and</w:t>
+        </w:r>
+      </w:ins>
+      <w:r>
+        <w:rPr/>
+        <w:t xml:space="preserve"> </w:t>
+      </w:r>
+      <w:ins w:author="A00020186 Ocean Wojcicki" w:date="2026-04-30T01:02:58.659Z" w16du:dateUtc="2026-04-30T01:02:58.659Z" w:id="628991705">
+        <w:r>
+          <w:t>will be co</w:t>
+        </w:r>
+        <w:r>
+          <w:t>mpati</w:t>
+        </w:r>
+        <w:r>
+          <w:t>ble</w:t>
+        </w:r>
+        <w:r>
+          <w:t xml:space="preserve"> for those using a ph</w:t>
+        </w:r>
+        <w:r>
+          <w:t xml:space="preserve">one. </w:t>
+        </w:r>
+      </w:ins>
+      <w:del w:author="A00020186 Ocean Wojcicki" w:date="2026-04-30T01:02:31.932Z" w16du:dateUtc="2026-04-30T01:02:31.932Z" w:id="1340749395">
+        <w:r>
+          <w:delText xml:space="preserve">it is compatible for those on a phone. </w:delText>
+        </w:r>
+      </w:del>
     </w:p>
     <w:p>
       <w:pPr>
@@ -662,49 +1361,205 @@
     <w:p>
       <w:pPr>
         <w:jc w:val="both"/>
-      </w:pPr>
-      <w:r>
-        <w:t>Users will also be given feedback based on their actions</w:t>
-      </w:r>
-      <w:r>
+        <w:rPr>
+          <w:del w:author="A00020186 Ocean Wojcicki" w:date="2026-04-30T01:03:36.941Z" w16du:dateUtc="2026-04-30T01:03:36.941Z" w:id="634764608"/>
+        </w:rPr>
+      </w:pPr>
+      <w:r>
+        <w:rPr/>
+        <w:t>Users will also be given feedback based on their a</w:t>
+      </w:r>
+      <w:r>
+        <w:rPr/>
+        <w:t>ction</w:t>
+      </w:r>
+      <w:r>
+        <w:rPr/>
+        <w:t>s</w:t>
+      </w:r>
+      <w:r>
+        <w:rPr/>
         <w:t>. There</w:t>
       </w:r>
       <w:r>
-        <w:t xml:space="preserve"> will be animations when clicking buttons, for example a hover effect </w:t>
-      </w:r>
-      <w:r>
-        <w:t xml:space="preserve">causing a pop out animation or a dark </w:t>
-      </w:r>
-      <w:r>
+        <w:rPr/>
+        <w:t xml:space="preserve"> will be animat</w:t>
+      </w:r>
+      <w:r>
+        <w:rPr/>
+        <w:t>ions when clic</w:t>
+      </w:r>
+      <w:r>
+        <w:rPr/>
+        <w:t>king buttons, for example a hove</w:t>
+      </w:r>
+      <w:r>
+        <w:rPr/>
+        <w:t>r effe</w:t>
+      </w:r>
+      <w:r>
+        <w:rPr/>
+        <w:t>c</w:t>
+      </w:r>
+      <w:r>
+        <w:rPr/>
+        <w:t xml:space="preserve">t </w:t>
+      </w:r>
+      <w:r>
+        <w:rPr/>
+        <w:t>caus</w:t>
+      </w:r>
+      <w:r>
+        <w:rPr/>
+        <w:t xml:space="preserve">ing a pop out animation or a dark </w:t>
+      </w:r>
+      <w:r>
+        <w:rPr/>
         <w:t>blue box surrounding the text in the navbar</w:t>
       </w:r>
       <w:r>
+        <w:rPr/>
         <w:t xml:space="preserve"> indicating that </w:t>
       </w:r>
       <w:r>
+        <w:rPr/>
         <w:t>it's</w:t>
       </w:r>
       <w:r>
+        <w:rPr/>
         <w:t xml:space="preserve"> been interacted with. An example of messages being returned would </w:t>
       </w:r>
       <w:r>
+        <w:rPr/>
         <w:t>be on the lost and found page</w:t>
       </w:r>
       <w:r>
+        <w:rPr/>
         <w:t>. If the user</w:t>
       </w:r>
       <w:r>
+        <w:rPr/>
         <w:t xml:space="preserve"> pres</w:t>
       </w:r>
       <w:r>
+        <w:rPr/>
         <w:t>ses</w:t>
       </w:r>
       <w:r>
-        <w:t xml:space="preserve"> “Claim”, it will turn grey with text “Claim requested” preventing them from cl</w:t>
-      </w:r>
-      <w:r>
+        <w:rPr/>
+        <w:t xml:space="preserve"> “Claim</w:t>
+      </w:r>
+      <w:r>
+        <w:rPr/>
+        <w:t>”,</w:t>
+      </w:r>
+      <w:r>
+        <w:rPr/>
+        <w:t xml:space="preserve"> it will turn grey with text “Claim requested” preventing them from cl</w:t>
+      </w:r>
+      <w:r>
+        <w:rPr/>
         <w:t xml:space="preserve">icking it again. </w:t>
       </w:r>
+      <w:ins w:author="A00020186 Ocean Wojcicki" w:date="2026-04-30T01:03:57.865Z" w16du:dateUtc="2026-04-30T01:03:57.865Z" w:id="1067303716">
+        <w:r>
+          <w:t xml:space="preserve">If a student clicks </w:t>
+        </w:r>
+        <w:r>
+          <w:t xml:space="preserve">“Submit” without </w:t>
+        </w:r>
+      </w:ins>
+      <w:ins w:author="A00020186 Ocean Wojcicki" w:date="2026-04-30T01:25:52.831Z" w16du:dateUtc="2026-04-30T01:25:52.831Z" w:id="376617846">
+        <w:r>
+          <w:t>entering</w:t>
+        </w:r>
+      </w:ins>
+      <w:ins w:author="A00020186 Ocean Wojcicki" w:date="2026-04-30T01:03:57.865Z" w16du:dateUtc="2026-04-30T01:03:57.865Z" w:id="1452536050">
+        <w:r>
+          <w:t xml:space="preserve"> their email,</w:t>
+        </w:r>
+        <w:r>
+          <w:t xml:space="preserve"> </w:t>
+        </w:r>
+        <w:r>
+          <w:t>t</w:t>
+        </w:r>
+        <w:r>
+          <w:t>h</w:t>
+        </w:r>
+        <w:r>
+          <w:t>e</w:t>
+        </w:r>
+        <w:r>
+          <w:t>y</w:t>
+        </w:r>
+        <w:r>
+          <w:t xml:space="preserve"> </w:t>
+        </w:r>
+        <w:r>
+          <w:t>w</w:t>
+        </w:r>
+        <w:r>
+          <w:t>i</w:t>
+        </w:r>
+        <w:r>
+          <w:t>l</w:t>
+        </w:r>
+        <w:r>
+          <w:t>l</w:t>
+        </w:r>
+        <w:r>
+          <w:t xml:space="preserve"> </w:t>
+        </w:r>
+        <w:r>
+          <w:t>b</w:t>
+        </w:r>
+        <w:r>
+          <w:t>e</w:t>
+        </w:r>
+        <w:r>
+          <w:t xml:space="preserve"> </w:t>
+        </w:r>
+        <w:r>
+          <w:t>t</w:t>
+        </w:r>
+        <w:r>
+          <w:t>o</w:t>
+        </w:r>
+        <w:r>
+          <w:t>l</w:t>
+        </w:r>
+        <w:r>
+          <w:t>d</w:t>
+        </w:r>
+        <w:r>
+          <w:t xml:space="preserve"> </w:t>
+        </w:r>
+        <w:r>
+          <w:t>t</w:t>
+        </w:r>
+        <w:r>
+          <w:t>o</w:t>
+        </w:r>
+        <w:r>
+          <w:t xml:space="preserve"> </w:t>
+        </w:r>
+        <w:r>
+          <w:t>d</w:t>
+        </w:r>
+        <w:r>
+          <w:t>o</w:t>
+        </w:r>
+        <w:r>
+          <w:t xml:space="preserve"> </w:t>
+        </w:r>
+        <w:r>
+          <w:t>s</w:t>
+        </w:r>
+        <w:r>
+          <w:t>o.</w:t>
+        </w:r>
+      </w:ins>
     </w:p>
     <w:p>
       <w:pPr>
@@ -1165,6 +2020,11 @@
           <w:lang w:val="en-IE"/>
         </w:rPr>
         <w:br/>
+      </w:r>
+      <w:r>
+        <w:rPr>
+          <w:lang w:val="en-IE"/>
+        </w:rPr>
         <w:t>Hosting and</w:t>
       </w:r>
       <w:r>
@@ -1184,6 +2044,11 @@
           <w:lang w:val="en-IE"/>
         </w:rPr>
         <w:br/>
+      </w:r>
+      <w:r>
+        <w:rPr>
+          <w:lang w:val="en-IE"/>
+        </w:rPr>
         <w:t>Netlify provides you with a live link to an application</w:t>
       </w:r>
       <w:r>
@@ -1244,7 +2109,6 @@
         <w:rPr>
           <w:lang w:val="en-IE"/>
         </w:rPr>
-        <w:lastRenderedPageBreak/>
         <w:br/>
       </w:r>
       <w:r>
@@ -1320,6 +2184,11 @@
           <w:lang w:val="en-IE"/>
         </w:rPr>
         <w:br/>
+      </w:r>
+      <w:r>
+        <w:rPr>
+          <w:lang w:val="en-IE"/>
+        </w:rPr>
         <w:t>Testing and Maintenance:</w:t>
       </w:r>
     </w:p>
@@ -1367,7 +2236,7 @@
       </w:r>
     </w:p>
     <w:sectPr>
-      <w:pgSz w:w="12240" w:h="15840"/>
+      <w:pgSz w:w="12240" w:h="15840" w:orient="portrait"/>
       <w:pgMar w:top="1440" w:right="1440" w:bottom="1440" w:left="1440" w:header="720" w:footer="720" w:gutter="0"/>
       <w:cols w:space="720"/>
       <w:docGrid w:linePitch="360"/>
@@ -1510,11 +2379,11 @@
 </file>
 
 <file path=word/styles.xml><?xml version="1.0" encoding="utf-8"?>
-<w:styles xmlns:mc="http://schemas.openxmlformats.org/markup-compatibility/2006" xmlns:r="http://schemas.openxmlformats.org/officeDocument/2006/relationships" xmlns:w="http://schemas.openxmlformats.org/wordprocessingml/2006/main" xmlns:w14="http://schemas.microsoft.com/office/word/2010/wordml" xmlns:w15="http://schemas.microsoft.com/office/word/2012/wordml" xmlns:w16cex="http://schemas.microsoft.com/office/word/2018/wordml/cex" xmlns:w16cid="http://schemas.microsoft.com/office/word/2016/wordml/cid" xmlns:w16="http://schemas.microsoft.com/office/word/2018/wordml" xmlns:w16du="http://schemas.microsoft.com/office/word/2023/wordml/word16du" xmlns:w16sdtdh="http://schemas.microsoft.com/office/word/2020/wordml/sdtdatahash" xmlns:w16sdtfl="http://schemas.microsoft.com/office/word/2024/wordml/sdtformatlock" xmlns:w16se="http://schemas.microsoft.com/office/word/2015/wordml/symex" mc:Ignorable="w14 w15 w16se w16cid w16 w16cex w16sdtdh w16sdtfl w16du">
+<w:styles xmlns:wp14="http://schemas.microsoft.com/office/word/2010/wordprocessingDrawing" xmlns:mc="http://schemas.openxmlformats.org/markup-compatibility/2006" xmlns:r="http://schemas.openxmlformats.org/officeDocument/2006/relationships" xmlns:w="http://schemas.openxmlformats.org/wordprocessingml/2006/main" xmlns:w14="http://schemas.microsoft.com/office/word/2010/wordml" xmlns:w15="http://schemas.microsoft.com/office/word/2012/wordml" xmlns:w16cex="http://schemas.microsoft.com/office/word/2018/wordml/cex" xmlns:w16cid="http://schemas.microsoft.com/office/word/2016/wordml/cid" xmlns:w16="http://schemas.microsoft.com/office/word/2018/wordml" xmlns:w16du="http://schemas.microsoft.com/office/word/2023/wordml/word16du" xmlns:w16sdtdh="http://schemas.microsoft.com/office/word/2020/wordml/sdtdatahash" xmlns:w16sdtfl="http://schemas.microsoft.com/office/word/2024/wordml/sdtformatlock" xmlns:w16se="http://schemas.microsoft.com/office/word/2015/wordml/symex" mc:Ignorable="w14 w15 w16se w16cid w16 w16cex w16sdtdh w16sdtfl w16du wp14">
   <w:docDefaults>
     <w:rPrDefault>
       <w:rPr>
-        <w:rFonts w:asciiTheme="minorHAnsi" w:eastAsiaTheme="minorEastAsia" w:hAnsiTheme="minorHAnsi" w:cstheme="minorBidi"/>
+        <w:rFonts w:asciiTheme="minorHAnsi" w:hAnsiTheme="minorHAnsi" w:eastAsiaTheme="minorEastAsia" w:cstheme="minorBidi"/>
         <w:sz w:val="24"/>
         <w:szCs w:val="24"/>
         <w:lang w:val="en-US" w:eastAsia="ja-JP" w:bidi="ar-SA"/>
@@ -1529,14 +2398,14 @@
   <w:latentStyles w:defLockedState="0" w:defUIPriority="99" w:defSemiHidden="0" w:defUnhideWhenUsed="0" w:defQFormat="0" w:count="376">
     <w:lsdException w:name="Normal" w:uiPriority="0" w:qFormat="1"/>
     <w:lsdException w:name="heading 1" w:uiPriority="9" w:qFormat="1"/>
-    <w:lsdException w:name="heading 2" w:semiHidden="1" w:uiPriority="9" w:unhideWhenUsed="1" w:qFormat="1"/>
-    <w:lsdException w:name="heading 3" w:semiHidden="1" w:uiPriority="9" w:unhideWhenUsed="1" w:qFormat="1"/>
-    <w:lsdException w:name="heading 4" w:semiHidden="1" w:uiPriority="9" w:unhideWhenUsed="1" w:qFormat="1"/>
-    <w:lsdException w:name="heading 5" w:semiHidden="1" w:uiPriority="9" w:unhideWhenUsed="1" w:qFormat="1"/>
-    <w:lsdException w:name="heading 6" w:semiHidden="1" w:uiPriority="9" w:unhideWhenUsed="1" w:qFormat="1"/>
-    <w:lsdException w:name="heading 7" w:semiHidden="1" w:uiPriority="9" w:unhideWhenUsed="1" w:qFormat="1"/>
-    <w:lsdException w:name="heading 8" w:semiHidden="1" w:uiPriority="9" w:unhideWhenUsed="1" w:qFormat="1"/>
-    <w:lsdException w:name="heading 9" w:semiHidden="1" w:uiPriority="9" w:unhideWhenUsed="1" w:qFormat="1"/>
+    <w:lsdException w:name="heading 2" w:uiPriority="9" w:semiHidden="1" w:unhideWhenUsed="1" w:qFormat="1"/>
+    <w:lsdException w:name="heading 3" w:uiPriority="9" w:semiHidden="1" w:unhideWhenUsed="1" w:qFormat="1"/>
+    <w:lsdException w:name="heading 4" w:uiPriority="9" w:semiHidden="1" w:unhideWhenUsed="1" w:qFormat="1"/>
+    <w:lsdException w:name="heading 5" w:uiPriority="9" w:semiHidden="1" w:unhideWhenUsed="1" w:qFormat="1"/>
+    <w:lsdException w:name="heading 6" w:uiPriority="9" w:semiHidden="1" w:unhideWhenUsed="1" w:qFormat="1"/>
+    <w:lsdException w:name="heading 7" w:uiPriority="9" w:semiHidden="1" w:unhideWhenUsed="1" w:qFormat="1"/>
+    <w:lsdException w:name="heading 8" w:uiPriority="9" w:semiHidden="1" w:unhideWhenUsed="1" w:qFormat="1"/>
+    <w:lsdException w:name="heading 9" w:uiPriority="9" w:semiHidden="1" w:unhideWhenUsed="1" w:qFormat="1"/>
     <w:lsdException w:name="index 1" w:semiHidden="1" w:unhideWhenUsed="1"/>
     <w:lsdException w:name="index 2" w:semiHidden="1" w:unhideWhenUsed="1"/>
     <w:lsdException w:name="index 3" w:semiHidden="1" w:unhideWhenUsed="1"/>
@@ -1546,22 +2415,22 @@
     <w:lsdException w:name="index 7" w:semiHidden="1" w:unhideWhenUsed="1"/>
     <w:lsdException w:name="index 8" w:semiHidden="1" w:unhideWhenUsed="1"/>
     <w:lsdException w:name="index 9" w:semiHidden="1" w:unhideWhenUsed="1"/>
-    <w:lsdException w:name="toc 1" w:semiHidden="1" w:uiPriority="39" w:unhideWhenUsed="1"/>
-    <w:lsdException w:name="toc 2" w:semiHidden="1" w:uiPriority="39" w:unhideWhenUsed="1"/>
-    <w:lsdException w:name="toc 3" w:semiHidden="1" w:uiPriority="39" w:unhideWhenUsed="1"/>
-    <w:lsdException w:name="toc 4" w:semiHidden="1" w:uiPriority="39" w:unhideWhenUsed="1"/>
-    <w:lsdException w:name="toc 5" w:semiHidden="1" w:uiPriority="39" w:unhideWhenUsed="1"/>
-    <w:lsdException w:name="toc 6" w:semiHidden="1" w:uiPriority="39" w:unhideWhenUsed="1"/>
-    <w:lsdException w:name="toc 7" w:semiHidden="1" w:uiPriority="39" w:unhideWhenUsed="1"/>
-    <w:lsdException w:name="toc 8" w:semiHidden="1" w:uiPriority="39" w:unhideWhenUsed="1"/>
-    <w:lsdException w:name="toc 9" w:semiHidden="1" w:uiPriority="39" w:unhideWhenUsed="1"/>
+    <w:lsdException w:name="toc 1" w:uiPriority="39" w:semiHidden="1" w:unhideWhenUsed="1"/>
+    <w:lsdException w:name="toc 2" w:uiPriority="39" w:semiHidden="1" w:unhideWhenUsed="1"/>
+    <w:lsdException w:name="toc 3" w:uiPriority="39" w:semiHidden="1" w:unhideWhenUsed="1"/>
+    <w:lsdException w:name="toc 4" w:uiPriority="39" w:semiHidden="1" w:unhideWhenUsed="1"/>
+    <w:lsdException w:name="toc 5" w:uiPriority="39" w:semiHidden="1" w:unhideWhenUsed="1"/>
+    <w:lsdException w:name="toc 6" w:uiPriority="39" w:semiHidden="1" w:unhideWhenUsed="1"/>
+    <w:lsdException w:name="toc 7" w:uiPriority="39" w:semiHidden="1" w:unhideWhenUsed="1"/>
+    <w:lsdException w:name="toc 8" w:uiPriority="39" w:semiHidden="1" w:unhideWhenUsed="1"/>
+    <w:lsdException w:name="toc 9" w:uiPriority="39" w:semiHidden="1" w:unhideWhenUsed="1"/>
     <w:lsdException w:name="Normal Indent" w:semiHidden="1" w:unhideWhenUsed="1"/>
     <w:lsdException w:name="footnote text" w:semiHidden="1" w:unhideWhenUsed="1"/>
     <w:lsdException w:name="annotation text" w:semiHidden="1" w:unhideWhenUsed="1"/>
     <w:lsdException w:name="header" w:semiHidden="1" w:unhideWhenUsed="1"/>
     <w:lsdException w:name="footer" w:semiHidden="1" w:unhideWhenUsed="1"/>
     <w:lsdException w:name="index heading" w:semiHidden="1" w:unhideWhenUsed="1"/>
-    <w:lsdException w:name="caption" w:semiHidden="1" w:uiPriority="35" w:unhideWhenUsed="1" w:qFormat="1"/>
+    <w:lsdException w:name="caption" w:uiPriority="35" w:semiHidden="1" w:unhideWhenUsed="1" w:qFormat="1"/>
     <w:lsdException w:name="table of figures" w:semiHidden="1" w:unhideWhenUsed="1"/>
     <w:lsdException w:name="envelope address" w:semiHidden="1" w:unhideWhenUsed="1"/>
     <w:lsdException w:name="envelope return" w:semiHidden="1" w:unhideWhenUsed="1"/>
@@ -1592,7 +2461,7 @@
     <w:lsdException w:name="Title" w:uiPriority="10" w:qFormat="1"/>
     <w:lsdException w:name="Closing" w:semiHidden="1" w:unhideWhenUsed="1"/>
     <w:lsdException w:name="Signature" w:semiHidden="1" w:unhideWhenUsed="1"/>
-    <w:lsdException w:name="Default Paragraph Font" w:semiHidden="1" w:uiPriority="1" w:unhideWhenUsed="1"/>
+    <w:lsdException w:name="Default Paragraph Font" w:uiPriority="1" w:semiHidden="1" w:unhideWhenUsed="1"/>
     <w:lsdException w:name="Body Text" w:semiHidden="1" w:unhideWhenUsed="1"/>
     <w:lsdException w:name="Body Text Indent" w:semiHidden="1" w:unhideWhenUsed="1"/>
     <w:lsdException w:name="List Continue" w:semiHidden="1" w:unhideWhenUsed="1"/>
@@ -1792,8 +2661,8 @@
     <w:lsdException w:name="Subtle Reference" w:uiPriority="31" w:qFormat="1"/>
     <w:lsdException w:name="Intense Reference" w:uiPriority="32" w:qFormat="1"/>
     <w:lsdException w:name="Book Title" w:uiPriority="33" w:qFormat="1"/>
-    <w:lsdException w:name="Bibliography" w:semiHidden="1" w:uiPriority="37" w:unhideWhenUsed="1"/>
-    <w:lsdException w:name="TOC Heading" w:semiHidden="1" w:uiPriority="39" w:unhideWhenUsed="1" w:qFormat="1"/>
+    <w:lsdException w:name="Bibliography" w:uiPriority="37" w:semiHidden="1" w:unhideWhenUsed="1"/>
+    <w:lsdException w:name="TOC Heading" w:uiPriority="39" w:semiHidden="1" w:unhideWhenUsed="1" w:qFormat="1"/>
     <w:lsdException w:name="Plain Table 1" w:uiPriority="41"/>
     <w:lsdException w:name="Plain Table 2" w:uiPriority="42"/>
     <w:lsdException w:name="Plain Table 3" w:uiPriority="43"/>
@@ -1904,16 +2773,16 @@
     <w:lsdException w:name="Unresolved Mention" w:semiHidden="1" w:unhideWhenUsed="1"/>
     <w:lsdException w:name="Smart Link" w:semiHidden="1" w:unhideWhenUsed="1"/>
   </w:latentStyles>
-  <w:style w:type="paragraph" w:default="1" w:styleId="Normal">
+  <w:style w:type="paragraph" w:styleId="Normal" w:default="1">
     <w:name w:val="Normal"/>
     <w:qFormat/>
   </w:style>
-  <w:style w:type="character" w:default="1" w:styleId="DefaultParagraphFont">
+  <w:style w:type="character" w:styleId="DefaultParagraphFont" w:default="1">
     <w:name w:val="Default Paragraph Font"/>
     <w:uiPriority w:val="1"/>
     <w:unhideWhenUsed/>
   </w:style>
-  <w:style w:type="table" w:default="1" w:styleId="TableNormal">
+  <w:style w:type="table" w:styleId="TableNormal" w:default="1">
     <w:name w:val="Normal Table"/>
     <w:uiPriority w:val="99"/>
     <w:semiHidden/>
@@ -1928,17 +2797,43 @@
       </w:tblCellMar>
     </w:tblPr>
   </w:style>
-  <w:style w:type="numbering" w:default="1" w:styleId="NoList">
+  <w:style w:type="numbering" w:styleId="NoList" w:default="1">
     <w:name w:val="No List"/>
     <w:uiPriority w:val="99"/>
     <w:semiHidden/>
     <w:unhideWhenUsed/>
   </w:style>
+  <w:style xmlns:w="http://schemas.openxmlformats.org/wordprocessingml/2006/main" w:type="table" w:styleId="TableGrid">
+    <w:name xmlns:w="http://schemas.openxmlformats.org/wordprocessingml/2006/main" w:val="Table Grid"/>
+    <w:basedOn xmlns:w="http://schemas.openxmlformats.org/wordprocessingml/2006/main" w:val="TableNormal"/>
+    <w:uiPriority xmlns:w="http://schemas.openxmlformats.org/wordprocessingml/2006/main" w:val="59"/>
+    <w:rsid xmlns:w="http://schemas.openxmlformats.org/wordprocessingml/2006/main" w:val="00FB4123"/>
+    <w:pPr xmlns:w="http://schemas.openxmlformats.org/wordprocessingml/2006/main">
+      <w:spacing w:after="0" w:line="240" w:lineRule="auto"/>
+    </w:pPr>
+    <w:tblPr xmlns:w="http://schemas.openxmlformats.org/wordprocessingml/2006/main">
+      <w:tblInd w:w="0" w:type="dxa"/>
+      <w:tblBorders>
+        <w:top w:val="single" w:color="000000" w:themeColor="text1" w:sz="4" w:space="0"/>
+        <w:left w:val="single" w:color="000000" w:themeColor="text1" w:sz="4" w:space="0"/>
+        <w:bottom w:val="single" w:color="000000" w:themeColor="text1" w:sz="4" w:space="0"/>
+        <w:right w:val="single" w:color="000000" w:themeColor="text1" w:sz="4" w:space="0"/>
+        <w:insideH w:val="single" w:color="000000" w:themeColor="text1" w:sz="4" w:space="0"/>
+        <w:insideV w:val="single" w:color="000000" w:themeColor="text1" w:sz="4" w:space="0"/>
+      </w:tblBorders>
+      <w:tblCellMar>
+        <w:top w:w="0" w:type="dxa"/>
+        <w:left w:w="108" w:type="dxa"/>
+        <w:bottom w:w="0" w:type="dxa"/>
+        <w:right w:w="108" w:type="dxa"/>
+      </w:tblCellMar>
+    </w:tblPr>
+  </w:style>
 </w:styles>
 </file>
 
 <file path=word/theme/theme1.xml><?xml version="1.0" encoding="utf-8"?>
-<a:theme xmlns:a="http://schemas.openxmlformats.org/drawingml/2006/main" name="Office Theme">
+<a:theme xmlns:a="http://schemas.openxmlformats.org/drawingml/2006/main" xmlns:thm15="http://schemas.microsoft.com/office/thememl/2012/main" name="Office Theme">
   <a:themeElements>
     <a:clrScheme name="Office">
       <a:dk1>

</xml_diff>